<commit_message>
Added specializations for different number of contracts
</commit_message>
<xml_diff>
--- a/data/templates/claim.docx
+++ b/data/templates/claim.docx
@@ -1010,7 +1010,23 @@
           <w:sz w:val="24"/>
           <w:szCs w:val="24"/>
         </w:rPr>
-        <w:t>(далее – Ответчик) предметом которых является подача (поставка) Истцом Ответчику тепловой энергии и/или теплоносителя (далее – ТЭ), на условиях, определенных Договорами:</w:t>
+        <w:t>(далее – Ответчик) предметом которых является подача (поставка) Истцом Ответчи</w:t>
+      </w:r>
+      <w:r>
+        <w:rPr>
+          <w:rFonts w:eastAsia="Times New Roman" w:cs="Times New Roman" w:ascii="Times New Roman" w:hAnsi="Times New Roman"/>
+          <w:sz w:val="24"/>
+          <w:szCs w:val="24"/>
+        </w:rPr>
+        <w:t>ку /*поставляемые ресурсы*/,</w:t>
+      </w:r>
+      <w:r>
+        <w:rPr>
+          <w:rFonts w:eastAsia="Times New Roman" w:cs="Times New Roman" w:ascii="Times New Roman" w:hAnsi="Times New Roman"/>
+          <w:sz w:val="24"/>
+          <w:szCs w:val="24"/>
+        </w:rPr>
+        <w:t xml:space="preserve"> на условиях, определенных Договорами:</w:t>
       </w:r>
     </w:p>
     <w:tbl>
@@ -1666,35 +1682,47 @@
           <w:shd w:fill="auto" w:val="clear"/>
           <w:vertAlign w:val="baseline"/>
         </w:rPr>
-        <w:t xml:space="preserve">В соответствии с условиями Договоров в период, указанный в соответствующей графе вышеизложенной таблицы (далее – Период), Истец поставил Ответчику через присоединенную сеть в соответствии с Договором </w:t>
-      </w:r>
-      <w:r>
-        <w:rPr>
-          <w:rFonts w:eastAsia="Times New Roman" w:cs="Times New Roman" w:ascii="Times New Roman" w:hAnsi="Times New Roman"/>
-          <w:sz w:val="24"/>
-          <w:szCs w:val="24"/>
-        </w:rPr>
-        <w:t>/*тип договора*/</w:t>
-      </w:r>
-      <w:r>
-        <w:rPr>
-          <w:rFonts w:eastAsia="Times New Roman" w:cs="Times New Roman" w:ascii="Times New Roman" w:hAnsi="Times New Roman"/>
-          <w:b w:val="false"/>
-          <w:i w:val="false"/>
-          <w:caps w:val="false"/>
-          <w:smallCaps w:val="false"/>
-          <w:strike w:val="false"/>
-          <w:dstrike w:val="false"/>
-          <w:color w:val="000000"/>
-          <w:position w:val="0"/>
-          <w:sz w:val="24"/>
-          <w:sz w:val="24"/>
-          <w:szCs w:val="24"/>
-          <w:u w:val="none"/>
-          <w:shd w:fill="auto" w:val="clear"/>
-          <w:vertAlign w:val="baseline"/>
-        </w:rPr>
-        <w:t xml:space="preserve">, а Ответчик, соответственно, обязан оплатить полученные ресурсы на основании указанных Договоров и установленных тарифов для соответствующих групп потребителей. </w:t>
+        <w:t xml:space="preserve">В соответствии с условиями Договоров в период, указанный в соответствующей графе вышеизложенной таблицы (далее – Период), Истец поставил Ответчику через присоединенную сеть в соответствии </w:t>
+      </w:r>
+      <w:r>
+        <w:rPr>
+          <w:rFonts w:eastAsia="Times New Roman" w:cs="Times New Roman" w:ascii="Times New Roman" w:hAnsi="Times New Roman"/>
+          <w:b w:val="false"/>
+          <w:i w:val="false"/>
+          <w:caps w:val="false"/>
+          <w:smallCaps w:val="false"/>
+          <w:strike w:val="false"/>
+          <w:dstrike w:val="false"/>
+          <w:color w:val="000000"/>
+          <w:position w:val="0"/>
+          <w:sz w:val="24"/>
+          <w:sz w:val="24"/>
+          <w:szCs w:val="24"/>
+          <w:u w:val="none"/>
+          <w:shd w:fill="auto" w:val="clear"/>
+          <w:vertAlign w:val="baseline"/>
+        </w:rPr>
+        <w:t xml:space="preserve">с /*тип договора2*/, </w:t>
+      </w:r>
+      <w:r>
+        <w:rPr>
+          <w:rFonts w:eastAsia="Times New Roman" w:cs="Times New Roman" w:ascii="Times New Roman" w:hAnsi="Times New Roman"/>
+          <w:b w:val="false"/>
+          <w:i w:val="false"/>
+          <w:caps w:val="false"/>
+          <w:smallCaps w:val="false"/>
+          <w:strike w:val="false"/>
+          <w:dstrike w:val="false"/>
+          <w:color w:val="000000"/>
+          <w:position w:val="0"/>
+          <w:sz w:val="24"/>
+          <w:sz w:val="24"/>
+          <w:szCs w:val="24"/>
+          <w:u w:val="none"/>
+          <w:shd w:fill="auto" w:val="clear"/>
+          <w:vertAlign w:val="baseline"/>
+        </w:rPr>
+        <w:t xml:space="preserve">а Ответчик, соответственно, обязан оплатить полученные ресурсы на основании указанных Договоров и установленных тарифов для соответствующих групп потребителей. </w:t>
       </w:r>
     </w:p>
     <w:p>
@@ -2071,7 +2099,47 @@
           <w:shd w:fill="auto" w:val="clear"/>
           <w:vertAlign w:val="baseline"/>
         </w:rPr>
-        <w:t>Факт поставки тепловой энергии/теплоносителя в указанном в настоящем Иске количестве подтверждается соответствующими документами, прилагаемыми к настоящему иску, в том числе: актами приема-передачи энергоресурсов, счетами на оплату, счетами-фактурами.</w:t>
+        <w:t>Факт постав</w:t>
+      </w:r>
+      <w:r>
+        <w:rPr>
+          <w:rFonts w:eastAsia="Times New Roman" w:cs="Times New Roman" w:ascii="Times New Roman" w:hAnsi="Times New Roman"/>
+          <w:b w:val="false"/>
+          <w:i w:val="false"/>
+          <w:caps w:val="false"/>
+          <w:smallCaps w:val="false"/>
+          <w:strike w:val="false"/>
+          <w:dstrike w:val="false"/>
+          <w:color w:val="000000"/>
+          <w:position w:val="0"/>
+          <w:sz w:val="24"/>
+          <w:sz w:val="24"/>
+          <w:szCs w:val="24"/>
+          <w:u w:val="none"/>
+          <w:shd w:fill="auto" w:val="clear"/>
+          <w:vertAlign w:val="baseline"/>
+        </w:rPr>
+        <w:t xml:space="preserve">ки /*поставляемые ресурсы2*/ в </w:t>
+      </w:r>
+      <w:r>
+        <w:rPr>
+          <w:rFonts w:eastAsia="Times New Roman" w:cs="Times New Roman" w:ascii="Times New Roman" w:hAnsi="Times New Roman"/>
+          <w:b w:val="false"/>
+          <w:i w:val="false"/>
+          <w:caps w:val="false"/>
+          <w:smallCaps w:val="false"/>
+          <w:strike w:val="false"/>
+          <w:dstrike w:val="false"/>
+          <w:color w:val="000000"/>
+          <w:position w:val="0"/>
+          <w:sz w:val="24"/>
+          <w:sz w:val="24"/>
+          <w:szCs w:val="24"/>
+          <w:u w:val="none"/>
+          <w:shd w:fill="auto" w:val="clear"/>
+          <w:vertAlign w:val="baseline"/>
+        </w:rPr>
+        <w:t>указанном в настоящем Иске количестве подтверждается соответствующими документами, прилагаемыми к настоящему иску, в том числе: актами приема-передачи энергоресурсов, счетами на оплату, счетами-фактурами.</w:t>
       </w:r>
     </w:p>
     <w:p>
@@ -2122,9 +2190,47 @@
           <w:shd w:fill="auto" w:val="clear"/>
           <w:vertAlign w:val="baseline"/>
         </w:rPr>
-        <w:t xml:space="preserve">Таким образом, Истец свои обязательства по Договорам исполнил надлежащим образом и в полном объеме, поставив Ответчику тепловую энергию/теплоноситель </w:t>
-        <w:br/>
-        <w:t xml:space="preserve">в соответствии с принятыми на себя обязательствами в отношении количества, качества </w:t>
+        <w:t>Таким образом, Истец свои обязательства по Договорам исполнил надлежащим образом и в полном объеме, поставив Ответч</w:t>
+      </w:r>
+      <w:r>
+        <w:rPr>
+          <w:rFonts w:eastAsia="Times New Roman" w:cs="Times New Roman" w:ascii="Times New Roman" w:hAnsi="Times New Roman"/>
+          <w:b w:val="false"/>
+          <w:i w:val="false"/>
+          <w:caps w:val="false"/>
+          <w:smallCaps w:val="false"/>
+          <w:strike w:val="false"/>
+          <w:dstrike w:val="false"/>
+          <w:color w:val="000000"/>
+          <w:position w:val="0"/>
+          <w:sz w:val="24"/>
+          <w:sz w:val="24"/>
+          <w:szCs w:val="24"/>
+          <w:u w:val="none"/>
+          <w:shd w:fill="auto" w:val="clear"/>
+          <w:vertAlign w:val="baseline"/>
+        </w:rPr>
+        <w:t xml:space="preserve">ику /*поставляемые ресурсы3*/ в </w:t>
+      </w:r>
+      <w:r>
+        <w:rPr>
+          <w:rFonts w:eastAsia="Times New Roman" w:cs="Times New Roman" w:ascii="Times New Roman" w:hAnsi="Times New Roman"/>
+          <w:b w:val="false"/>
+          <w:i w:val="false"/>
+          <w:caps w:val="false"/>
+          <w:smallCaps w:val="false"/>
+          <w:strike w:val="false"/>
+          <w:dstrike w:val="false"/>
+          <w:color w:val="000000"/>
+          <w:position w:val="0"/>
+          <w:sz w:val="24"/>
+          <w:sz w:val="24"/>
+          <w:szCs w:val="24"/>
+          <w:u w:val="none"/>
+          <w:shd w:fill="auto" w:val="clear"/>
+          <w:vertAlign w:val="baseline"/>
+        </w:rPr>
+        <w:t xml:space="preserve">соответствии с принятыми на себя обязательствами в отношении количества, качества </w:t>
         <w:br/>
         <w:t>и сроков их поставки. Ответчик оплату в полном размере не произвел.</w:t>
       </w:r>
@@ -2387,7 +2493,47 @@
           <w:shd w:fill="auto" w:val="clear"/>
           <w:vertAlign w:val="baseline"/>
         </w:rPr>
-        <w:t xml:space="preserve">Поскольку Ответчик свои обязательства по оплате поставленной ТЭ исполнил ненадлежащим образом, Истцом направлены в его адрес </w:t>
+        <w:t>Поскольку Ответчик свои обязательства по оплате поставле</w:t>
+      </w:r>
+      <w:r>
+        <w:rPr>
+          <w:rFonts w:eastAsia="Times New Roman" w:cs="Times New Roman" w:ascii="Times New Roman" w:hAnsi="Times New Roman"/>
+          <w:b w:val="false"/>
+          <w:i w:val="false"/>
+          <w:caps w:val="false"/>
+          <w:smallCaps w:val="false"/>
+          <w:strike w:val="false"/>
+          <w:dstrike w:val="false"/>
+          <w:color w:val="000000"/>
+          <w:position w:val="0"/>
+          <w:sz w:val="24"/>
+          <w:sz w:val="24"/>
+          <w:szCs w:val="24"/>
+          <w:u w:val="none"/>
+          <w:shd w:fill="auto" w:val="clear"/>
+          <w:vertAlign w:val="baseline"/>
+        </w:rPr>
+        <w:t>нной /*поставляемые ресурсы4*/ ис</w:t>
+      </w:r>
+      <w:r>
+        <w:rPr>
+          <w:rFonts w:eastAsia="Times New Roman" w:cs="Times New Roman" w:ascii="Times New Roman" w:hAnsi="Times New Roman"/>
+          <w:b w:val="false"/>
+          <w:i w:val="false"/>
+          <w:caps w:val="false"/>
+          <w:smallCaps w:val="false"/>
+          <w:strike w:val="false"/>
+          <w:dstrike w:val="false"/>
+          <w:color w:val="000000"/>
+          <w:position w:val="0"/>
+          <w:sz w:val="24"/>
+          <w:sz w:val="24"/>
+          <w:szCs w:val="24"/>
+          <w:u w:val="none"/>
+          <w:shd w:fill="auto" w:val="clear"/>
+          <w:vertAlign w:val="baseline"/>
+        </w:rPr>
+        <w:t xml:space="preserve">полнил ненадлежащим образом, Истцом направлены в его адрес </w:t>
       </w:r>
       <w:r>
         <w:rPr>

</xml_diff>

<commit_message>
make adding new paragraphs
</commit_message>
<xml_diff>
--- a/data/templates/claim.docx
+++ b/data/templates/claim.docx
@@ -1687,7 +1687,47 @@
           <w:shd w:fill="auto" w:val="clear"/>
           <w:vertAlign w:val="baseline"/>
         </w:rPr>
-        <w:t xml:space="preserve">В соответствии с условиями /*мн.ч.4*/ в период, указанный в соответствующей графе вышеизложенной таблицы (далее – Период), Истец поставил Ответчику через присоединенную сеть в соответствии с /*тип договора2*/, а Ответчик, соответственно, обязан оплатить полученные ресурсы на основании /*мн.ч.5*/ и установленных тарифов для соответствующих групп потребителей. </w:t>
+        <w:t xml:space="preserve">В соответствии с условиями /*мн.ч.4*/ в период, указанный в соответствующей графе вышеизложенной таблицы (далее – Период), Истец поставил Ответчику через присоединенную сеть в </w:t>
+      </w:r>
+      <w:r>
+        <w:rPr>
+          <w:rFonts w:eastAsia="Times New Roman" w:cs="Times New Roman" w:ascii="Times New Roman" w:hAnsi="Times New Roman"/>
+          <w:b w:val="false"/>
+          <w:i w:val="false"/>
+          <w:caps w:val="false"/>
+          <w:smallCaps w:val="false"/>
+          <w:strike w:val="false"/>
+          <w:dstrike w:val="false"/>
+          <w:color w:val="000000"/>
+          <w:position w:val="0"/>
+          <w:sz w:val="24"/>
+          <w:sz w:val="24"/>
+          <w:szCs w:val="24"/>
+          <w:u w:val="none"/>
+          <w:shd w:fill="auto" w:val="clear"/>
+          <w:vertAlign w:val="baseline"/>
+        </w:rPr>
+        <w:t>соответствии с /*мн.ч.*/ /*тип договора*/, а Ответчик</w:t>
+      </w:r>
+      <w:r>
+        <w:rPr>
+          <w:rFonts w:eastAsia="Times New Roman" w:cs="Times New Roman" w:ascii="Times New Roman" w:hAnsi="Times New Roman"/>
+          <w:b w:val="false"/>
+          <w:i w:val="false"/>
+          <w:caps w:val="false"/>
+          <w:smallCaps w:val="false"/>
+          <w:strike w:val="false"/>
+          <w:dstrike w:val="false"/>
+          <w:color w:val="000000"/>
+          <w:position w:val="0"/>
+          <w:sz w:val="24"/>
+          <w:sz w:val="24"/>
+          <w:szCs w:val="24"/>
+          <w:u w:val="none"/>
+          <w:shd w:fill="auto" w:val="clear"/>
+          <w:vertAlign w:val="baseline"/>
+        </w:rPr>
+        <w:t xml:space="preserve">, соответственно, обязан оплатить полученные ресурсы на основании /*мн.ч.5*/ и установленных тарифов для соответствующих групп потребителей. </w:t>
       </w:r>
     </w:p>
     <w:p>
@@ -2604,15 +2644,7 @@
           <w:sz w:val="24"/>
           <w:szCs w:val="24"/>
         </w:rPr>
-        <w:t>/</w:t>
-      </w:r>
-      <w:r>
-        <w:rPr>
-          <w:rFonts w:eastAsia="Times New Roman" w:cs="Times New Roman" w:ascii="Times New Roman" w:hAnsi="Times New Roman"/>
-          <w:sz w:val="24"/>
-          <w:szCs w:val="24"/>
-        </w:rPr>
-        <w:t>*абзац важный*/</w:t>
+        <w:t>/*абзац важный*/</w:t>
       </w:r>
     </w:p>
     <w:p>
@@ -3901,23 +3933,7 @@
           <w:sz w:val="24"/>
           <w:szCs w:val="24"/>
         </w:rPr>
-        <w:t xml:space="preserve">/*ответчик </w:t>
-      </w:r>
-      <w:r>
-        <w:rPr>
-          <w:rFonts w:eastAsia="Times New Roman" w:cs="Times New Roman" w:ascii="Times New Roman" w:hAnsi="Times New Roman"/>
-          <w:sz w:val="24"/>
-          <w:szCs w:val="24"/>
-        </w:rPr>
-        <w:t>полное</w:t>
-      </w:r>
-      <w:r>
-        <w:rPr>
-          <w:rFonts w:eastAsia="Times New Roman" w:cs="Times New Roman" w:ascii="Times New Roman" w:hAnsi="Times New Roman"/>
-          <w:sz w:val="24"/>
-          <w:szCs w:val="24"/>
-        </w:rPr>
-        <w:t xml:space="preserve"> имя*/ </w:t>
+        <w:t xml:space="preserve">/*ответчик полное имя*/ </w:t>
       </w:r>
       <w:r>
         <w:rPr>
@@ -4436,35 +4452,7 @@
           <w:shd w:fill="auto" w:val="clear"/>
           <w:vertAlign w:val="baseline"/>
         </w:rPr>
-        <w:t xml:space="preserve"> с </w:t>
-      </w:r>
-      <w:r>
-        <w:rPr>
-          <w:rFonts w:eastAsia="Times New Roman" w:cs="Times New Roman" w:ascii="Times New Roman" w:hAnsi="Times New Roman"/>
-          <w:sz w:val="24"/>
-          <w:szCs w:val="24"/>
-        </w:rPr>
-        <w:t>/*ответчик полное имя*/</w:t>
-      </w:r>
-      <w:r>
-        <w:rPr>
-          <w:rFonts w:eastAsia="Times New Roman" w:cs="Times New Roman" w:ascii="Times New Roman" w:hAnsi="Times New Roman"/>
-          <w:b w:val="false"/>
-          <w:i w:val="false"/>
-          <w:caps w:val="false"/>
-          <w:smallCaps w:val="false"/>
-          <w:strike w:val="false"/>
-          <w:dstrike w:val="false"/>
-          <w:color w:val="000000"/>
-          <w:position w:val="0"/>
-          <w:sz w:val="24"/>
-          <w:sz w:val="24"/>
-          <w:szCs w:val="24"/>
-          <w:u w:val="none"/>
-          <w:shd w:fill="auto" w:val="clear"/>
-          <w:vertAlign w:val="baseline"/>
-        </w:rPr>
-        <w:t xml:space="preserve"> (ОГРН </w:t>
+        <w:t xml:space="preserve"> с /*ответчик полное имя*/ (ОГРН </w:t>
       </w:r>
       <w:r>
         <w:rPr>

</xml_diff>

<commit_message>
fix many bugs with formats
</commit_message>
<xml_diff>
--- a/data/templates/claim.docx
+++ b/data/templates/claim.docx
@@ -891,7 +891,7 @@
           <w:sz w:val="24"/>
           <w:szCs w:val="24"/>
         </w:rPr>
-        <w:t>о взыскании задолженности за тепловую энергию и теплоноситель</w:t>
+        <w:t>о взыскании задолженности за /*поставляемые ресурсы5*/</w:t>
       </w:r>
     </w:p>
     <w:p>
@@ -1014,24 +1014,7 @@
           <w:sz w:val="24"/>
           <w:szCs w:val="24"/>
         </w:rPr>
-        <w:t xml:space="preserve">(далее – Ответчик) были </w:t>
-      </w:r>
-      <w:r>
-        <w:rPr>
-          <w:rFonts w:eastAsia="Times New Roman" w:cs="Times New Roman" w:ascii="Times New Roman" w:hAnsi="Times New Roman"/>
-          <w:sz w:val="24"/>
-          <w:szCs w:val="24"/>
-          <w:lang w:eastAsia="ru-RU"/>
-        </w:rPr>
-        <w:t xml:space="preserve">заключены </w:t>
-      </w:r>
-      <w:r>
-        <w:rPr>
-          <w:rFonts w:eastAsia="Times New Roman" w:cs="Times New Roman" w:ascii="Times New Roman" w:hAnsi="Times New Roman"/>
-          <w:sz w:val="24"/>
-          <w:szCs w:val="24"/>
-        </w:rPr>
-        <w:t>следующие договоры (далее именуемые – Договоры), предметом которых является подача (поставка) Истцом Ответчику /*поставляемые ресурсы*/, на условиях, определенных /*мн.ч.*/:</w:t>
+        <w:t>(далее – Ответчик) /*мн.ч.7*/ является подача (поставка) Истцом Ответчику /*поставляемые ресурсы*/:</w:t>
       </w:r>
     </w:p>
     <w:tbl>
@@ -1687,7 +1670,27 @@
           <w:shd w:fill="auto" w:val="clear"/>
           <w:vertAlign w:val="baseline"/>
         </w:rPr>
-        <w:t xml:space="preserve">В соответствии с условиями /*мн.ч.4*/ в период, указанный в соответствующей графе вышеизложенной таблицы (далее – Период), Истец поставил Ответчику через присоединенную сеть в соответствии с /*мн.ч.*/ /*тип договора*/, а Ответчик, соответственно, обязан оплатить полученные ресурсы на основании /*мн.ч.5*/ и установленных тарифов для соответствующих групп потребителей. </w:t>
+        <w:t>В</w:t>
+      </w:r>
+      <w:r>
+        <w:rPr>
+          <w:rFonts w:eastAsia="Times New Roman" w:cs="Times New Roman" w:ascii="Times New Roman" w:hAnsi="Times New Roman"/>
+          <w:b w:val="false"/>
+          <w:i w:val="false"/>
+          <w:caps w:val="false"/>
+          <w:smallCaps w:val="false"/>
+          <w:strike w:val="false"/>
+          <w:dstrike w:val="false"/>
+          <w:color w:val="000000"/>
+          <w:position w:val="0"/>
+          <w:sz w:val="24"/>
+          <w:sz w:val="24"/>
+          <w:szCs w:val="24"/>
+          <w:u w:val="none"/>
+          <w:shd w:fill="auto" w:val="clear"/>
+          <w:vertAlign w:val="baseline"/>
+        </w:rPr>
+        <w:t xml:space="preserve"> соответствии с условиями /*мн.ч.4*/ в период, указанный в соответствующей графе вышеизложенной таблицы (далее – Период), Истец поставил Ответчику через присоединенную сеть в соответствии с /*мн.ч.*/ /*тип договора*/, а Ответчик, соответственно, обязан оплатить полученные ресурсы на основании /*мн.ч.5*/ и установленных тарифов для соответствующих групп потребителей. </w:t>
       </w:r>
     </w:p>
     <w:p>
@@ -1706,22 +1709,9 @@
         <w:ind w:firstLine="709" w:left="0" w:right="0"/>
         <w:jc w:val="both"/>
         <w:rPr>
-          <w:rFonts w:ascii="Times New Roman" w:hAnsi="Times New Roman" w:eastAsia="Times New Roman" w:cs="Times New Roman"/>
-          <w:b w:val="false"/>
-          <w:i w:val="false"/>
-          <w:i w:val="false"/>
-          <w:caps w:val="false"/>
-          <w:smallCaps w:val="false"/>
-          <w:strike w:val="false"/>
-          <w:dstrike w:val="false"/>
-          <w:color w:val="000000"/>
-          <w:position w:val="0"/>
-          <w:sz w:val="24"/>
-          <w:sz w:val="24"/>
-          <w:szCs w:val="24"/>
-          <w:u w:val="none"/>
-          <w:shd w:fill="auto" w:val="clear"/>
-          <w:vertAlign w:val="baseline"/>
+          <w:rFonts w:ascii="Times New Roman" w:hAnsi="Times New Roman"/>
+          <w:sz w:val="24"/>
+          <w:szCs w:val="24"/>
         </w:rPr>
       </w:pPr>
       <w:r>
@@ -1750,6 +1740,8 @@
         <w:rPr>
           <w:rFonts w:eastAsia="Times New Roman" w:cs="Times New Roman" w:ascii="Times New Roman" w:hAnsi="Times New Roman"/>
           <w:b/>
+          <w:sz w:val="24"/>
+          <w:szCs w:val="24"/>
         </w:rPr>
         <w:t xml:space="preserve">/*сумма долга*/ </w:t>
       </w:r>
@@ -1829,10 +1821,18 @@
         <w:spacing w:lineRule="auto" w:line="240" w:before="0" w:after="0"/>
         <w:ind w:firstLine="709" w:left="0" w:right="0"/>
         <w:jc w:val="both"/>
-        <w:rPr/>
-      </w:pPr>
-      <w:r>
-        <w:rPr/>
+        <w:rPr>
+          <w:rFonts w:ascii="Times New Roman" w:hAnsi="Times New Roman"/>
+          <w:sz w:val="24"/>
+          <w:szCs w:val="24"/>
+        </w:rPr>
+      </w:pPr>
+      <w:r>
+        <w:rPr>
+          <w:rFonts w:ascii="Times New Roman" w:hAnsi="Times New Roman"/>
+          <w:sz w:val="24"/>
+          <w:szCs w:val="24"/>
+        </w:rPr>
         <w:t xml:space="preserve"> </w:t>
       </w:r>
       <w:r>
@@ -1841,149 +1841,17 @@
           <w:sz w:val="24"/>
           <w:szCs w:val="24"/>
         </w:rPr>
-        <w:t>/*мн.ч.*/</w:t>
-      </w:r>
-    </w:p>
-    <w:p>
-      <w:pPr>
-        <w:pStyle w:val="normal1"/>
-        <w:keepNext w:val="false"/>
-        <w:keepLines w:val="false"/>
-        <w:pageBreakBefore w:val="false"/>
-        <w:widowControl/>
-        <w:numPr>
-          <w:ilvl w:val="0"/>
-          <w:numId w:val="5"/>
-        </w:numPr>
-        <w:shd w:val="clear" w:fill="auto"/>
-        <w:spacing w:lineRule="auto" w:line="240" w:before="0" w:after="0"/>
-        <w:ind w:hanging="360" w:left="720" w:right="0"/>
-        <w:jc w:val="both"/>
-        <w:rPr>
-          <w:highlight w:val="none"/>
-          <w:shd w:fill="auto" w:val="clear"/>
-        </w:rPr>
-      </w:pPr>
-      <w:r>
-        <w:rPr>
-          <w:rFonts w:eastAsia="Times New Roman" w:cs="Times New Roman" w:ascii="Times New Roman" w:hAnsi="Times New Roman"/>
-          <w:b w:val="false"/>
-          <w:i w:val="false"/>
-          <w:caps w:val="false"/>
-          <w:smallCaps w:val="false"/>
-          <w:strike w:val="false"/>
-          <w:dstrike w:val="false"/>
-          <w:color w:val="000000"/>
-          <w:position w:val="0"/>
-          <w:sz w:val="24"/>
-          <w:sz w:val="24"/>
-          <w:szCs w:val="24"/>
-          <w:u w:val="none"/>
-          <w:shd w:fill="auto" w:val="clear"/>
-          <w:vertAlign w:val="baseline"/>
-        </w:rPr>
-        <w:t>раздел</w:t>
-      </w:r>
-      <w:r>
-        <w:rPr>
-          <w:rFonts w:eastAsia="Times New Roman" w:cs="Times New Roman" w:ascii="Times New Roman" w:hAnsi="Times New Roman"/>
-          <w:sz w:val="24"/>
-          <w:szCs w:val="24"/>
-          <w:shd w:fill="auto" w:val="clear"/>
-        </w:rPr>
-        <w:t xml:space="preserve"> /*номер раздела*/</w:t>
-      </w:r>
-      <w:r>
-        <w:rPr>
-          <w:rFonts w:eastAsia="Times New Roman" w:cs="Times New Roman" w:ascii="Times New Roman" w:hAnsi="Times New Roman"/>
-          <w:b w:val="false"/>
-          <w:i w:val="false"/>
-          <w:caps w:val="false"/>
-          <w:smallCaps w:val="false"/>
-          <w:strike w:val="false"/>
-          <w:dstrike w:val="false"/>
-          <w:color w:val="000000"/>
-          <w:position w:val="0"/>
-          <w:sz w:val="24"/>
-          <w:sz w:val="24"/>
-          <w:szCs w:val="24"/>
-          <w:u w:val="none"/>
-          <w:shd w:fill="auto" w:val="clear"/>
-          <w:vertAlign w:val="baseline"/>
-        </w:rPr>
-        <w:t xml:space="preserve">, в том числе пункт </w:t>
-      </w:r>
-      <w:r>
-        <w:rPr>
-          <w:rFonts w:eastAsia="Times New Roman" w:cs="Times New Roman" w:ascii="Times New Roman" w:hAnsi="Times New Roman"/>
-          <w:shd w:fill="auto" w:val="clear"/>
-        </w:rPr>
-        <w:t>/*пункт*/</w:t>
-      </w:r>
-      <w:r>
-        <w:rPr>
-          <w:rFonts w:eastAsia="Times New Roman" w:cs="Times New Roman" w:ascii="Times New Roman" w:hAnsi="Times New Roman"/>
-          <w:b w:val="false"/>
-          <w:i w:val="false"/>
-          <w:caps w:val="false"/>
-          <w:smallCaps w:val="false"/>
-          <w:strike w:val="false"/>
-          <w:dstrike w:val="false"/>
-          <w:color w:val="000000"/>
-          <w:position w:val="0"/>
-          <w:sz w:val="24"/>
-          <w:sz w:val="24"/>
-          <w:szCs w:val="24"/>
-          <w:u w:val="none"/>
-          <w:shd w:fill="auto" w:val="clear"/>
-          <w:vertAlign w:val="baseline"/>
-        </w:rPr>
-        <w:t xml:space="preserve"> договора </w:t>
-      </w:r>
-      <w:r>
-        <w:rPr>
-          <w:rFonts w:eastAsia="Times New Roman" w:cs="Times New Roman" w:ascii="Times New Roman" w:hAnsi="Times New Roman"/>
-          <w:sz w:val="24"/>
-          <w:szCs w:val="24"/>
-          <w:shd w:fill="auto" w:val="clear"/>
-        </w:rPr>
-        <w:t>/*номер договора*/</w:t>
-      </w:r>
-    </w:p>
-    <w:p>
-      <w:pPr>
-        <w:pStyle w:val="normal1"/>
-        <w:keepNext w:val="false"/>
-        <w:keepLines w:val="false"/>
-        <w:pageBreakBefore w:val="false"/>
-        <w:widowControl w:val="false"/>
-        <w:shd w:val="clear" w:fill="auto"/>
-        <w:tabs>
-          <w:tab w:val="clear" w:pos="720"/>
-          <w:tab w:val="left" w:pos="1136" w:leader="none"/>
-        </w:tabs>
-        <w:spacing w:lineRule="auto" w:line="240" w:before="0" w:after="0"/>
-        <w:ind w:firstLine="709" w:left="0" w:right="0"/>
-        <w:jc w:val="both"/>
-        <w:rPr>
-          <w:rFonts w:ascii="Times New Roman" w:hAnsi="Times New Roman" w:eastAsia="Times New Roman" w:cs="Times New Roman"/>
-          <w:b w:val="false"/>
-          <w:i w:val="false"/>
-          <w:i w:val="false"/>
-          <w:caps w:val="false"/>
-          <w:smallCaps w:val="false"/>
-          <w:strike w:val="false"/>
-          <w:dstrike w:val="false"/>
-          <w:color w:val="000000"/>
-          <w:position w:val="0"/>
-          <w:sz w:val="24"/>
-          <w:sz w:val="24"/>
-          <w:szCs w:val="24"/>
-          <w:u w:val="none"/>
-          <w:shd w:fill="auto" w:val="clear"/>
-          <w:vertAlign w:val="baseline"/>
-        </w:rPr>
-      </w:pPr>
+        <w:t xml:space="preserve">/*мн.ч.*/ </w:t>
+      </w:r>
+      <w:r>
+        <w:rPr>
+          <w:rFonts w:eastAsia="Times New Roman" w:cs="Times New Roman" w:ascii="Times New Roman" w:hAnsi="Times New Roman"/>
+          <w:sz w:val="24"/>
+          <w:szCs w:val="24"/>
+          <w:shd w:fill="auto" w:val="clear"/>
+        </w:rPr>
+        <w:t xml:space="preserve">/*список разделов*/ </w:t>
+      </w:r>
       <w:r>
         <w:rPr>
           <w:rFonts w:eastAsia="Times New Roman" w:cs="Times New Roman" w:ascii="Times New Roman" w:hAnsi="Times New Roman"/>
@@ -2017,22 +1885,7 @@
         <w:ind w:firstLine="709" w:left="0" w:right="0"/>
         <w:jc w:val="both"/>
         <w:rPr>
-          <w:rFonts w:ascii="Times New Roman" w:hAnsi="Times New Roman" w:eastAsia="Times New Roman" w:cs="Times New Roman"/>
-          <w:b w:val="false"/>
-          <w:i w:val="false"/>
-          <w:i w:val="false"/>
-          <w:caps w:val="false"/>
-          <w:smallCaps w:val="false"/>
-          <w:strike w:val="false"/>
-          <w:dstrike w:val="false"/>
-          <w:color w:val="000000"/>
-          <w:position w:val="0"/>
-          <w:sz w:val="24"/>
-          <w:sz w:val="24"/>
-          <w:szCs w:val="24"/>
-          <w:u w:val="none"/>
-          <w:shd w:fill="auto" w:val="clear"/>
-          <w:vertAlign w:val="baseline"/>
+          <w:rFonts w:ascii="Times New Roman" w:hAnsi="Times New Roman"/>
         </w:rPr>
       </w:pPr>
       <w:r>
@@ -2104,60 +1957,116 @@
           <w:shd w:fill="auto" w:val="clear"/>
           <w:vertAlign w:val="baseline"/>
         </w:rPr>
-        <w:t xml:space="preserve">Таким образом, Истец свои обязательства по /*мн.ч.2*/ исполнил надлежащим образом и в полном объеме, поставив Ответчику /*поставляемые ресурсы3*/ в соответствии с принятыми на себя обязательствами в отношении количества, качества </w:t>
+        <w:t xml:space="preserve">Таким образом, Истец свои обязательства по /*мн.ч.2*/ исполнил надлежащим образом и в полном объеме, поставив Ответчику </w:t>
+      </w:r>
+      <w:r>
+        <w:rPr>
+          <w:rFonts w:eastAsia="Times New Roman" w:cs="Times New Roman" w:ascii="Times New Roman" w:hAnsi="Times New Roman"/>
+          <w:b w:val="false"/>
+          <w:i w:val="false"/>
+          <w:caps w:val="false"/>
+          <w:smallCaps w:val="false"/>
+          <w:strike w:val="false"/>
+          <w:dstrike w:val="false"/>
+          <w:color w:val="000000"/>
+          <w:position w:val="0"/>
+          <w:sz w:val="24"/>
+          <w:sz w:val="24"/>
+          <w:szCs w:val="24"/>
+          <w:u w:val="none"/>
+          <w:shd w:fill="auto" w:val="clear"/>
+          <w:vertAlign w:val="baseline"/>
+        </w:rPr>
+        <w:t xml:space="preserve">/*поставляемые ресурсы3*/ в соответствии с принятыми на себя обязательствами в отношении количества, качества </w:t>
         <w:br/>
         <w:t>и сроков их поставки. Ответчик оплату в полном размере не произвел.</w:t>
       </w:r>
     </w:p>
     <w:p>
       <w:pPr>
-        <w:pStyle w:val="normal1"/>
-        <w:keepNext w:val="false"/>
-        <w:keepLines w:val="false"/>
+        <w:pStyle w:val="NoSpacing"/>
+        <w:ind w:firstLine="709"/>
+        <w:jc w:val="both"/>
+        <w:rPr>
+          <w:rFonts w:ascii="Times New Roman" w:hAnsi="Times New Roman" w:cs="Times New Roman"/>
+          <w:sz w:val="24"/>
+          <w:szCs w:val="24"/>
+        </w:rPr>
+      </w:pPr>
+      <w:r>
+        <w:rPr>
+          <w:rFonts w:cs="Times New Roman" w:ascii="Times New Roman" w:hAnsi="Times New Roman"/>
+          <w:sz w:val="24"/>
+          <w:szCs w:val="24"/>
+        </w:rPr>
+        <w:t xml:space="preserve">Как следует из содержания п. 2 ст. 421, ст. 426, п. 4 ст. 445 Гражданского кодекса Российской Федерации (далее - ГК РФ) принуждать потребителя к заключению договора энергоснабжения теплоснабжающая организация не вправе. В тех случаях, когда потребитель пользуется услугами энергоснабжения, однако от заключения договора уклоняется, фактическое пользование абонентом тепловой энергией расценивается </w:t>
+        <w:br/>
+        <w:t>в соответствии с п. 3 ст. 438 ГК РФ как акцепт абонентом оферты.</w:t>
+      </w:r>
+    </w:p>
+    <w:p>
+      <w:pPr>
+        <w:pStyle w:val="NoSpacing"/>
+        <w:ind w:firstLine="709"/>
+        <w:jc w:val="both"/>
+        <w:rPr>
+          <w:rFonts w:ascii="Times New Roman" w:hAnsi="Times New Roman" w:cs="Times New Roman"/>
+          <w:sz w:val="24"/>
+          <w:szCs w:val="24"/>
+        </w:rPr>
+      </w:pPr>
+      <w:r>
+        <w:rPr>
+          <w:rFonts w:eastAsia="Times New Roman" w:cs="Times New Roman" w:ascii="Times New Roman" w:hAnsi="Times New Roman"/>
+          <w:b w:val="false"/>
+          <w:i w:val="false"/>
+          <w:caps w:val="false"/>
+          <w:smallCaps w:val="false"/>
+          <w:strike w:val="false"/>
+          <w:dstrike w:val="false"/>
+          <w:color w:val="000000"/>
+          <w:position w:val="0"/>
+          <w:sz w:val="24"/>
+          <w:sz w:val="24"/>
+          <w:szCs w:val="24"/>
+          <w:u w:val="none"/>
+          <w:shd w:fill="auto" w:val="clear"/>
+          <w:vertAlign w:val="baseline"/>
+        </w:rPr>
+        <w:t>Согласно п. 3 Информационного письма Президиума ВАС РФ от 17.02.1998 г. № 30 «Обзор практики разрешения споров, связанных с договором энергоснабжения» отсутствие договорных отношений с организацией, чьи теплопотребляющие установки присоединены к сетям энергоснабжающей организации не освобождает потребителя обязанности возместить стоимость отпущенной ему тепловой энергии.</w:t>
+      </w:r>
+    </w:p>
+    <w:p>
+      <w:pPr>
+        <w:pStyle w:val="NoSpacing"/>
         <w:pageBreakBefore w:val="false"/>
-        <w:widowControl/>
-        <w:shd w:val="clear" w:fill="auto"/>
-        <w:spacing w:lineRule="auto" w:line="240" w:before="0" w:after="0"/>
-        <w:ind w:firstLine="709" w:left="0" w:right="0"/>
+        <w:ind w:firstLine="709"/>
         <w:jc w:val="both"/>
         <w:rPr>
-          <w:rFonts w:ascii="Times New Roman" w:hAnsi="Times New Roman" w:eastAsia="Times New Roman" w:cs="Times New Roman"/>
+          <w:rFonts w:ascii="Times New Roman" w:hAnsi="Times New Roman" w:cs="Times New Roman"/>
+          <w:sz w:val="24"/>
+          <w:szCs w:val="24"/>
+        </w:rPr>
+      </w:pPr>
+      <w:r>
+        <w:rPr>
+          <w:rFonts w:eastAsia="Times New Roman" w:cs="Times New Roman" w:ascii="Times New Roman" w:hAnsi="Times New Roman"/>
           <w:b w:val="false"/>
           <w:i w:val="false"/>
-          <w:i w:val="false"/>
-          <w:caps w:val="false"/>
-          <w:smallCaps w:val="false"/>
-          <w:strike w:val="false"/>
-          <w:dstrike w:val="false"/>
-          <w:color w:val="000000"/>
-          <w:position w:val="0"/>
-          <w:sz w:val="24"/>
-          <w:sz w:val="24"/>
-          <w:szCs w:val="24"/>
-          <w:u w:val="none"/>
-          <w:shd w:fill="auto" w:val="clear"/>
-          <w:vertAlign w:val="baseline"/>
-        </w:rPr>
-      </w:pPr>
-      <w:r>
-        <w:rPr>
-          <w:rFonts w:eastAsia="Times New Roman" w:cs="Times New Roman" w:ascii="Times New Roman" w:hAnsi="Times New Roman"/>
-          <w:b w:val="false"/>
-          <w:i w:val="false"/>
-          <w:caps w:val="false"/>
-          <w:smallCaps w:val="false"/>
-          <w:strike w:val="false"/>
-          <w:dstrike w:val="false"/>
-          <w:color w:val="000000"/>
-          <w:position w:val="0"/>
-          <w:sz w:val="24"/>
-          <w:sz w:val="24"/>
-          <w:szCs w:val="24"/>
-          <w:u w:val="none"/>
-          <w:shd w:fill="auto" w:val="clear"/>
-          <w:vertAlign w:val="baseline"/>
-        </w:rPr>
-        <w:t>В соответствии с п. 1 ст. 539 Гражданского кодекса Российской Федерации (далее – «ГК РФ») по договору энергоснабжения энергоснабжающая организация обязуется подавать абоненту (потребителю) через присоединенную сеть энергию, а абонент обязуется оплачивать принятую энергию, а также соблюдать предусмотренный договором режим ее потребления, обеспечивать безопасность эксплуатации находящихся в его ведении энергетических сетей и исправность используемых им приборов и оборудования, связанных с потреблением энергии.</w:t>
+          <w:caps w:val="false"/>
+          <w:smallCaps w:val="false"/>
+          <w:strike w:val="false"/>
+          <w:dstrike w:val="false"/>
+          <w:color w:val="000000"/>
+          <w:position w:val="0"/>
+          <w:sz w:val="24"/>
+          <w:sz w:val="24"/>
+          <w:szCs w:val="24"/>
+          <w:u w:val="none"/>
+          <w:shd w:fill="auto" w:val="clear"/>
+          <w:vertAlign w:val="baseline"/>
+        </w:rPr>
+        <w:t>В соответствии с п. 1 ст. 539 ГК РФ по договору энергоснабжения энергоснабжающая организация обязуется подавать абоненту (потребителю) через присоединенную сеть энергию, а абонент обязуется оплачивать принятую энергию, а также соблюдать предусмотренный договором режим ее потребления, обеспечивать безопасность эксплуатации находящихся в его ведении энергетических сетей и исправность используемых им приборов и оборудования, связанных с потреблением энергии.</w:t>
       </w:r>
     </w:p>
     <w:p>
@@ -2569,41 +2478,6 @@
           <w:sz w:val="24"/>
           <w:szCs w:val="24"/>
         </w:rPr>
-        <w:t xml:space="preserve">В соответствии с частью 9.3 статьи 15 Федерального закона от 27.07.2010 </w:t>
-        <w:br/>
-        <w:t xml:space="preserve">№ 190-ФЗ «О теплоснабжении» управляющие организации, приобретающие тепловую энергию (мощность) и (или) теплоноситель для целей предоставления коммунальных услуг, организации, осуществляющие горячее водоснабжение, холодное водоснабжение и (или) водоотведение по договорам горячего водоснабжения и договорам поставки горячей воды, а также теплоснабжающие организации, приобретающие тепловую энергию (мощность) </w:t>
-        <w:br/>
-        <w:t xml:space="preserve">и (или) теплоноситель по договору поставки тепловой энергии (мощности) и (или) теплоносителя, в случае несвоевременной и (или) неполной оплаты тепловой энергии (мощности) и (или) теплоносителя уплачивают единой теплоснабжающей организации (теплоснабжающей организации) пени в размере одной трехсотой ставки рефинансирования Центрального банка Российской Федерации, действующей на день фактической оплаты, от не выплаченной в срок суммы за каждый день просрочки начиная со дня, следующего за днем наступления установленного срока оплаты, по день фактической оплаты, произведенной в течение шестидесяти календарных дней со дня наступления установленного срока оплаты, либо до истечения шестидесяти календарных дней после дня наступления установленного срока оплаты, если в шестидесятидневный срок оплата не произведена. Начиная с шестьдесят первого дня, следующего за днем наступления установленного срока оплаты, по день фактической оплаты, произведенной </w:t>
-        <w:br/>
-        <w:t xml:space="preserve">в течение девяноста календарных дней со дня наступления установленного срока оплаты, либо до истечения девяноста календарных дней после дня наступления установленного срока оплаты, если в девяностодневный срок оплата не произведена, пени уплачиваются </w:t>
-        <w:br/>
-        <w:t xml:space="preserve">в размере одной стосемидесятой ставки рефинансирования Центрального банка Российской Федерации, действующей на день фактической оплаты, от не выплаченной </w:t>
-        <w:br/>
-        <w:t xml:space="preserve">в срок суммы за каждый день просрочки. Начиная с девяносто первого дня, следующего </w:t>
-        <w:br/>
-        <w:t xml:space="preserve">за днем наступления установленного срока оплаты, по день фактической оплаты пени уплачиваются в размере одной стотридцатой ставки рефинансирования Центрального банка Российской Федерации, действующей на день фактической оплаты, </w:t>
-        <w:br/>
-        <w:t>от не выплаченной в срок суммы за каждый день просрочки.</w:t>
-      </w:r>
-    </w:p>
-    <w:p>
-      <w:pPr>
-        <w:pStyle w:val="normal1"/>
-        <w:spacing w:lineRule="auto" w:line="240" w:before="0" w:after="0"/>
-        <w:ind w:firstLine="709"/>
-        <w:jc w:val="both"/>
-        <w:rPr>
-          <w:rFonts w:ascii="Times New Roman" w:hAnsi="Times New Roman" w:eastAsia="Times New Roman" w:cs="Times New Roman"/>
-          <w:sz w:val="24"/>
-          <w:szCs w:val="24"/>
-        </w:rPr>
-      </w:pPr>
-      <w:r>
-        <w:rPr>
-          <w:rFonts w:eastAsia="Times New Roman" w:cs="Times New Roman" w:ascii="Times New Roman" w:hAnsi="Times New Roman"/>
-          <w:sz w:val="24"/>
-          <w:szCs w:val="24"/>
-        </w:rPr>
         <w:t>/*абзац важный*/</w:t>
       </w:r>
     </w:p>
@@ -2627,15 +2501,11 @@
           <w:sz w:val="24"/>
           <w:szCs w:val="24"/>
         </w:rPr>
-        <w:t>Пунктом 1 Постановления Правительства РФ от 26 марта 2022 г. № 474</w:t>
+        <w:t>Пунктом 1 Постановления Правительства РФ от 26.03.2022 г. № 474</w:t>
         <w:br/>
-        <w:t xml:space="preserve">«О некоторых особенностях регулирования жилищных отношений в 2022 - 2024 годах» </w:t>
+        <w:t xml:space="preserve">«О некоторых особенностях регулирования жилищных отношений в 2022 - 2024 годах», пунктом 1 Постановления Правительства РФ от 29 декабря 2023 г. № 2382 </w:t>
         <w:br/>
-        <w:t xml:space="preserve">(в ред. пп. «б» п. 1 Постановления Правительства РФ от 29 декабря 2023 г. № 2382 </w:t>
-        <w:br/>
-        <w:t>«О внесении изменений в постановление Правительства Российской Федерации от 26 марта 2022 г. № 474»), пунктом 1 Постановления Правительства РФ от 18 марта 2025 г. № 329</w:t>
-        <w:br/>
-        <w:t xml:space="preserve">«О некоторых особенностях регулирования жилищных отношений в 2025 - 2026 годах» установлено, что </w:t>
+        <w:t xml:space="preserve">«О внесении изменений в постановление Правительства Российской Федерации от 26 марта 2022 г. № 474»), пунктом 1 Постановления Правительства РФ от 18 марта 2025 г. № 329 «О некоторых особенностях регулирования жилищных отношений в 2025 - 2026 годах» установлено, что </w:t>
       </w:r>
       <w:r>
         <w:rPr>
@@ -2652,9 +2522,7 @@
           <w:sz w:val="24"/>
           <w:szCs w:val="24"/>
         </w:rPr>
-        <w:t xml:space="preserve"> начисление </w:t>
-        <w:br/>
-        <w:t xml:space="preserve">и уплата пени в случае неполного и (или) несвоевременного внесения платы за жилое помещение и коммунальные услуги, взносов на капитальный ремонт, установленных жилищным законодательством Российской Федерации, а также </w:t>
+        <w:t xml:space="preserve"> начисление и уплата пени в случае неполного и (или) несвоевременного внесения платы за жилое помещение и коммунальные услуги, взносов на капитальный ремонт, установленных жилищным законодательством Российской Федерации, а также </w:t>
       </w:r>
       <w:r>
         <w:rPr>
@@ -2680,11 +2548,7 @@
           <w:sz w:val="24"/>
           <w:szCs w:val="24"/>
         </w:rPr>
-        <w:t xml:space="preserve"> обязательство </w:t>
-        <w:br/>
-        <w:t xml:space="preserve">по оплате услуг, предоставляемых на основании договоров в соответствии </w:t>
-        <w:br/>
-        <w:t>с законодательством Российской Федерации</w:t>
+        <w:t xml:space="preserve"> обязательство по оплате услуг, предоставляемых на основании договоров в соответствии с законодательством Российской Федерации</w:t>
       </w:r>
       <w:r>
         <w:rPr>
@@ -2693,7 +2557,6 @@
           <w:szCs w:val="24"/>
         </w:rPr>
         <w:t xml:space="preserve"> о газоснабжении, об электроэнергетике, </w:t>
-        <w:br/>
       </w:r>
       <w:r>
         <w:rPr>
@@ -2763,9 +2626,7 @@
           <w:szCs w:val="24"/>
           <w:u w:val="single"/>
         </w:rPr>
-        <w:t xml:space="preserve">ключевая ставка Центрального банка Российской Федерации, действующая </w:t>
-        <w:br/>
-        <w:t>по состоянию на 27 февраля 2022 г., и ключевая ставка Банка России, действующая на день фактической оплаты.</w:t>
+        <w:t>ключевая ставка Центрального банка Российской Федерации, действующая по состоянию на 27 февраля 2022 г., и ключевая ставка Банка России, действующая на день фактической оплаты.</w:t>
       </w:r>
     </w:p>
     <w:p>
@@ -3714,47 +3575,7 @@
           <w:shd w:fill="auto" w:val="clear"/>
           <w:vertAlign w:val="baseline"/>
         </w:rPr>
-        <w:t xml:space="preserve">На основании вышеизложенного, в соответствии со статьями 309, 310, 395, 539, 541, 544 Гражданского </w:t>
-      </w:r>
-      <w:r>
-        <w:rPr>
-          <w:rFonts w:eastAsia="Times New Roman" w:cs="Times New Roman" w:ascii="Times New Roman" w:hAnsi="Times New Roman"/>
-          <w:b w:val="false"/>
-          <w:i w:val="false"/>
-          <w:caps w:val="false"/>
-          <w:smallCaps w:val="false"/>
-          <w:strike w:val="false"/>
-          <w:dstrike w:val="false"/>
-          <w:color w:val="000000"/>
-          <w:position w:val="0"/>
-          <w:sz w:val="24"/>
-          <w:sz w:val="24"/>
-          <w:szCs w:val="24"/>
-          <w:u w:val="none"/>
-          <w:shd w:fill="auto" w:val="clear"/>
-          <w:vertAlign w:val="baseline"/>
-        </w:rPr>
-        <w:t>кодекса РФ, /*нужная статья*/, статьями 4, 125 Арбитражного</w:t>
-      </w:r>
-      <w:r>
-        <w:rPr>
-          <w:rFonts w:eastAsia="Times New Roman" w:cs="Times New Roman" w:ascii="Times New Roman" w:hAnsi="Times New Roman"/>
-          <w:b w:val="false"/>
-          <w:i w:val="false"/>
-          <w:caps w:val="false"/>
-          <w:smallCaps w:val="false"/>
-          <w:strike w:val="false"/>
-          <w:dstrike w:val="false"/>
-          <w:color w:val="000000"/>
-          <w:position w:val="0"/>
-          <w:sz w:val="24"/>
-          <w:sz w:val="24"/>
-          <w:szCs w:val="24"/>
-          <w:u w:val="none"/>
-          <w:shd w:fill="auto" w:val="clear"/>
-          <w:vertAlign w:val="baseline"/>
-        </w:rPr>
-        <w:t xml:space="preserve"> процессуального кодекса Российской Федерации,</w:t>
+        <w:t>На основании вышеизложенного, в соответствии со статьями 309, 310, 395, 539, 541, 544 Гражданского кодекса РФ, /*нужная статья*/, статьями 4, 125 Арбитражного процессуального кодекса Российской Федерации,</w:t>
       </w:r>
     </w:p>
     <w:p>
@@ -4605,7 +4426,7 @@
         <w:widowControl/>
         <w:numPr>
           <w:ilvl w:val="0"/>
-          <w:numId w:val="6"/>
+          <w:numId w:val="5"/>
         </w:numPr>
         <w:shd w:val="clear" w:fill="auto"/>
         <w:spacing w:lineRule="auto" w:line="240" w:before="0" w:after="0"/>
@@ -5784,143 +5605,6 @@
   <w:abstractNum w:abstractNumId="5">
     <w:lvl w:ilvl="0">
       <w:start w:val="1"/>
-      <w:numFmt w:val="bullet"/>
-      <w:lvlText w:val="⎯"/>
-      <w:lvlJc w:val="left"/>
-      <w:pPr>
-        <w:tabs>
-          <w:tab w:val="num" w:pos="0"/>
-        </w:tabs>
-        <w:ind w:left="720" w:hanging="360"/>
-      </w:pPr>
-      <w:rPr>
-        <w:rFonts w:ascii="Noto Sans Symbols" w:hAnsi="Noto Sans Symbols" w:cs="Noto Sans Symbols" w:hint="default"/>
-      </w:rPr>
-    </w:lvl>
-    <w:lvl w:ilvl="1">
-      <w:start w:val="1"/>
-      <w:numFmt w:val="bullet"/>
-      <w:lvlText w:val="o"/>
-      <w:lvlJc w:val="left"/>
-      <w:pPr>
-        <w:tabs>
-          <w:tab w:val="num" w:pos="0"/>
-        </w:tabs>
-        <w:ind w:left="1440" w:hanging="360"/>
-      </w:pPr>
-      <w:rPr>
-        <w:rFonts w:ascii="Courier New" w:hAnsi="Courier New" w:cs="Courier New" w:hint="default"/>
-      </w:rPr>
-    </w:lvl>
-    <w:lvl w:ilvl="2">
-      <w:start w:val="1"/>
-      <w:numFmt w:val="bullet"/>
-      <w:lvlText w:val="▪"/>
-      <w:lvlJc w:val="left"/>
-      <w:pPr>
-        <w:tabs>
-          <w:tab w:val="num" w:pos="0"/>
-        </w:tabs>
-        <w:ind w:left="2160" w:hanging="360"/>
-      </w:pPr>
-      <w:rPr>
-        <w:rFonts w:ascii="Noto Sans Symbols" w:hAnsi="Noto Sans Symbols" w:cs="Noto Sans Symbols" w:hint="default"/>
-      </w:rPr>
-    </w:lvl>
-    <w:lvl w:ilvl="3">
-      <w:start w:val="1"/>
-      <w:numFmt w:val="bullet"/>
-      <w:lvlText w:val="●"/>
-      <w:lvlJc w:val="left"/>
-      <w:pPr>
-        <w:tabs>
-          <w:tab w:val="num" w:pos="0"/>
-        </w:tabs>
-        <w:ind w:left="2880" w:hanging="360"/>
-      </w:pPr>
-      <w:rPr>
-        <w:rFonts w:ascii="Noto Sans Symbols" w:hAnsi="Noto Sans Symbols" w:cs="Noto Sans Symbols" w:hint="default"/>
-      </w:rPr>
-    </w:lvl>
-    <w:lvl w:ilvl="4">
-      <w:start w:val="1"/>
-      <w:numFmt w:val="bullet"/>
-      <w:lvlText w:val="o"/>
-      <w:lvlJc w:val="left"/>
-      <w:pPr>
-        <w:tabs>
-          <w:tab w:val="num" w:pos="0"/>
-        </w:tabs>
-        <w:ind w:left="3600" w:hanging="360"/>
-      </w:pPr>
-      <w:rPr>
-        <w:rFonts w:ascii="Courier New" w:hAnsi="Courier New" w:cs="Courier New" w:hint="default"/>
-      </w:rPr>
-    </w:lvl>
-    <w:lvl w:ilvl="5">
-      <w:start w:val="1"/>
-      <w:numFmt w:val="bullet"/>
-      <w:lvlText w:val="▪"/>
-      <w:lvlJc w:val="left"/>
-      <w:pPr>
-        <w:tabs>
-          <w:tab w:val="num" w:pos="0"/>
-        </w:tabs>
-        <w:ind w:left="4320" w:hanging="360"/>
-      </w:pPr>
-      <w:rPr>
-        <w:rFonts w:ascii="Noto Sans Symbols" w:hAnsi="Noto Sans Symbols" w:cs="Noto Sans Symbols" w:hint="default"/>
-      </w:rPr>
-    </w:lvl>
-    <w:lvl w:ilvl="6">
-      <w:start w:val="1"/>
-      <w:numFmt w:val="bullet"/>
-      <w:lvlText w:val="●"/>
-      <w:lvlJc w:val="left"/>
-      <w:pPr>
-        <w:tabs>
-          <w:tab w:val="num" w:pos="0"/>
-        </w:tabs>
-        <w:ind w:left="5040" w:hanging="360"/>
-      </w:pPr>
-      <w:rPr>
-        <w:rFonts w:ascii="Noto Sans Symbols" w:hAnsi="Noto Sans Symbols" w:cs="Noto Sans Symbols" w:hint="default"/>
-      </w:rPr>
-    </w:lvl>
-    <w:lvl w:ilvl="7">
-      <w:start w:val="1"/>
-      <w:numFmt w:val="bullet"/>
-      <w:lvlText w:val="o"/>
-      <w:lvlJc w:val="left"/>
-      <w:pPr>
-        <w:tabs>
-          <w:tab w:val="num" w:pos="0"/>
-        </w:tabs>
-        <w:ind w:left="5760" w:hanging="360"/>
-      </w:pPr>
-      <w:rPr>
-        <w:rFonts w:ascii="Courier New" w:hAnsi="Courier New" w:cs="Courier New" w:hint="default"/>
-      </w:rPr>
-    </w:lvl>
-    <w:lvl w:ilvl="8">
-      <w:start w:val="1"/>
-      <w:numFmt w:val="bullet"/>
-      <w:lvlText w:val="▪"/>
-      <w:lvlJc w:val="left"/>
-      <w:pPr>
-        <w:tabs>
-          <w:tab w:val="num" w:pos="0"/>
-        </w:tabs>
-        <w:ind w:left="6480" w:hanging="360"/>
-      </w:pPr>
-      <w:rPr>
-        <w:rFonts w:ascii="Noto Sans Symbols" w:hAnsi="Noto Sans Symbols" w:cs="Noto Sans Symbols" w:hint="default"/>
-      </w:rPr>
-    </w:lvl>
-  </w:abstractNum>
-  <w:abstractNum w:abstractNumId="6">
-    <w:lvl w:ilvl="0">
-      <w:start w:val="1"/>
       <w:numFmt w:val="decimal"/>
       <w:lvlText w:val="%1)"/>
       <w:lvlJc w:val="left"/>
@@ -6037,7 +5721,7 @@
       <w:rPr/>
     </w:lvl>
   </w:abstractNum>
-  <w:abstractNum w:abstractNumId="7">
+  <w:abstractNum w:abstractNumId="6">
     <w:lvl w:ilvl="0">
       <w:start w:val="1"/>
       <w:numFmt w:val="none"/>
@@ -6173,9 +5857,6 @@
   </w:num>
   <w:num w:numId="6">
     <w:abstractNumId w:val="6"/>
-  </w:num>
-  <w:num w:numId="7">
-    <w:abstractNumId w:val="7"/>
   </w:num>
 </w:numbering>
 </file>

</xml_diff>

<commit_message>
fix type of resources in claim document
</commit_message>
<xml_diff>
--- a/data/templates/claim.docx
+++ b/data/templates/claim.docx
@@ -1617,9 +1617,7 @@
           <w:shd w:fill="auto" w:val="clear"/>
           <w:vertAlign w:val="baseline"/>
         </w:rPr>
-        <w:t xml:space="preserve">) в соответствии с принятыми </w:t>
-        <w:br/>
-        <w:t xml:space="preserve">на себя обязательствами. Точки поставки (адреса) указаны в /*мн.ч.3*/. </w:t>
+        <w:t xml:space="preserve">) в соответствии с принятыми на себя обязательствами. Точки поставки (адреса) указаны в /*мн.ч.3*/. </w:t>
       </w:r>
     </w:p>
     <w:p>
@@ -1670,27 +1668,7 @@
           <w:shd w:fill="auto" w:val="clear"/>
           <w:vertAlign w:val="baseline"/>
         </w:rPr>
-        <w:t>В</w:t>
-      </w:r>
-      <w:r>
-        <w:rPr>
-          <w:rFonts w:eastAsia="Times New Roman" w:cs="Times New Roman" w:ascii="Times New Roman" w:hAnsi="Times New Roman"/>
-          <w:b w:val="false"/>
-          <w:i w:val="false"/>
-          <w:caps w:val="false"/>
-          <w:smallCaps w:val="false"/>
-          <w:strike w:val="false"/>
-          <w:dstrike w:val="false"/>
-          <w:color w:val="000000"/>
-          <w:position w:val="0"/>
-          <w:sz w:val="24"/>
-          <w:sz w:val="24"/>
-          <w:szCs w:val="24"/>
-          <w:u w:val="none"/>
-          <w:shd w:fill="auto" w:val="clear"/>
-          <w:vertAlign w:val="baseline"/>
-        </w:rPr>
-        <w:t xml:space="preserve"> соответствии с условиями /*мн.ч.4*/ в период, указанный в соответствующей графе вышеизложенной таблицы (далее – Период), Истец поставил Ответчику через присоединенную сеть в соответствии с /*мн.ч.*/ /*тип договора*/, а Ответчик, соответственно, обязан оплатить полученные ресурсы на основании /*мн.ч.5*/ и установленных тарифов для соответствующих групп потребителей. </w:t>
+        <w:t xml:space="preserve">В соответствии с условиями /*мн.ч.4*/ в период, указанный в соответствующей графе вышеизложенной таблицы (далее – Период), Истец поставил Ответчику через присоединенную сеть в соответствии с /*мн.ч.*/ /*тип договора*/, а Ответчик, соответственно, обязан оплатить полученные ресурсы на основании /*мн.ч.5*/ и установленных тарифов для соответствующих групп потребителей. </w:t>
       </w:r>
     </w:p>
     <w:p>
@@ -1734,7 +1712,47 @@
         </w:rPr>
         <w:t xml:space="preserve">За Ответчиком по /*мн.ч.6*/ образовалась задолженность </w:t>
         <w:br/>
-        <w:t xml:space="preserve">за потребленные ресурсы (тепловую энергию и/или теплоноситель) в сумме </w:t>
+        <w:t xml:space="preserve">за потребленные </w:t>
+      </w:r>
+      <w:r>
+        <w:rPr>
+          <w:rFonts w:eastAsia="Times New Roman" w:cs="Times New Roman" w:ascii="Times New Roman" w:hAnsi="Times New Roman"/>
+          <w:b w:val="false"/>
+          <w:i w:val="false"/>
+          <w:caps w:val="false"/>
+          <w:smallCaps w:val="false"/>
+          <w:strike w:val="false"/>
+          <w:dstrike w:val="false"/>
+          <w:color w:val="000000"/>
+          <w:position w:val="0"/>
+          <w:sz w:val="24"/>
+          <w:sz w:val="24"/>
+          <w:szCs w:val="24"/>
+          <w:u w:val="none"/>
+          <w:shd w:fill="auto" w:val="clear"/>
+          <w:vertAlign w:val="baseline"/>
+        </w:rPr>
+        <w:t>ресурсы (/*поставляемые ресурсы3*/) в сум</w:t>
+      </w:r>
+      <w:r>
+        <w:rPr>
+          <w:rFonts w:eastAsia="Times New Roman" w:cs="Times New Roman" w:ascii="Times New Roman" w:hAnsi="Times New Roman"/>
+          <w:b w:val="false"/>
+          <w:i w:val="false"/>
+          <w:caps w:val="false"/>
+          <w:smallCaps w:val="false"/>
+          <w:strike w:val="false"/>
+          <w:dstrike w:val="false"/>
+          <w:color w:val="000000"/>
+          <w:position w:val="0"/>
+          <w:sz w:val="24"/>
+          <w:sz w:val="24"/>
+          <w:szCs w:val="24"/>
+          <w:u w:val="none"/>
+          <w:shd w:fill="auto" w:val="clear"/>
+          <w:vertAlign w:val="baseline"/>
+        </w:rPr>
+        <w:t xml:space="preserve">ме </w:t>
       </w:r>
       <w:r>
         <w:rPr>
@@ -1957,27 +1975,7 @@
           <w:shd w:fill="auto" w:val="clear"/>
           <w:vertAlign w:val="baseline"/>
         </w:rPr>
-        <w:t xml:space="preserve">Таким образом, Истец свои обязательства по /*мн.ч.2*/ исполнил надлежащим образом и в полном объеме, поставив Ответчику </w:t>
-      </w:r>
-      <w:r>
-        <w:rPr>
-          <w:rFonts w:eastAsia="Times New Roman" w:cs="Times New Roman" w:ascii="Times New Roman" w:hAnsi="Times New Roman"/>
-          <w:b w:val="false"/>
-          <w:i w:val="false"/>
-          <w:caps w:val="false"/>
-          <w:smallCaps w:val="false"/>
-          <w:strike w:val="false"/>
-          <w:dstrike w:val="false"/>
-          <w:color w:val="000000"/>
-          <w:position w:val="0"/>
-          <w:sz w:val="24"/>
-          <w:sz w:val="24"/>
-          <w:szCs w:val="24"/>
-          <w:u w:val="none"/>
-          <w:shd w:fill="auto" w:val="clear"/>
-          <w:vertAlign w:val="baseline"/>
-        </w:rPr>
-        <w:t xml:space="preserve">/*поставляемые ресурсы3*/ в соответствии с принятыми на себя обязательствами в отношении количества, качества </w:t>
+        <w:t xml:space="preserve">Таким образом, Истец свои обязательства по /*мн.ч.2*/ исполнил надлежащим образом и в полном объеме, поставив Ответчику /*поставляемые ресурсы3*/ в соответствии с принятыми на себя обязательствами в отношении количества, качества </w:t>
         <w:br/>
         <w:t>и сроков их поставки. Ответчик оплату в полном размере не произвел.</w:t>
       </w:r>

</xml_diff>

<commit_message>
fix errors in templae of claim document
</commit_message>
<xml_diff>
--- a/data/templates/claim.docx
+++ b/data/templates/claim.docx
@@ -977,7 +977,7 @@
           <w:sz w:val="24"/>
           <w:szCs w:val="24"/>
         </w:rPr>
-        <w:t>/*истец полное имя*/</w:t>
+        <w:t>ПАО «Московская объединенная энергетическая компания»</w:t>
       </w:r>
       <w:r>
         <w:rPr>
@@ -987,7 +987,7 @@
         </w:rPr>
         <w:t xml:space="preserve"> (далее – </w:t>
         <w:br/>
-        <w:t xml:space="preserve">/*истец сокращенное имя*/, Истец) и </w:t>
+        <w:t xml:space="preserve">ПАО «МОЭК», Истец) и </w:t>
       </w:r>
       <w:r>
         <w:rPr>
@@ -1014,7 +1014,35 @@
           <w:sz w:val="24"/>
           <w:szCs w:val="24"/>
         </w:rPr>
-        <w:t>(далее – Ответчик) /*мн.ч.7*/ является подача (поставка) Истцом Ответчику /*поставляемые ресурсы*/:</w:t>
+        <w:t xml:space="preserve">(далее – Ответчик) /*мн.ч.7*/ является подача (поставка) Истцом Ответчику /*поставляемые ресурсы*/, на условиях, определенных </w:t>
+      </w:r>
+      <w:r>
+        <w:rPr>
+          <w:rFonts w:eastAsia="Times New Roman" w:cs="Times New Roman" w:ascii="Times New Roman" w:hAnsi="Times New Roman"/>
+          <w:b w:val="false"/>
+          <w:i w:val="false"/>
+          <w:caps w:val="false"/>
+          <w:smallCaps w:val="false"/>
+          <w:strike w:val="false"/>
+          <w:dstrike w:val="false"/>
+          <w:color w:val="000000"/>
+          <w:position w:val="0"/>
+          <w:sz w:val="24"/>
+          <w:sz w:val="24"/>
+          <w:szCs w:val="24"/>
+          <w:u w:val="none"/>
+          <w:shd w:fill="auto" w:val="clear"/>
+          <w:vertAlign w:val="baseline"/>
+        </w:rPr>
+        <w:t>/*мн.ч.*/</w:t>
+      </w:r>
+      <w:r>
+        <w:rPr>
+          <w:rFonts w:eastAsia="Times New Roman" w:cs="Times New Roman" w:ascii="Times New Roman" w:hAnsi="Times New Roman"/>
+          <w:sz w:val="24"/>
+          <w:szCs w:val="24"/>
+        </w:rPr>
+        <w:t>:</w:t>
       </w:r>
     </w:p>
     <w:tbl>
@@ -1712,47 +1740,7 @@
         </w:rPr>
         <w:t xml:space="preserve">За Ответчиком по /*мн.ч.6*/ образовалась задолженность </w:t>
         <w:br/>
-        <w:t xml:space="preserve">за потребленные </w:t>
-      </w:r>
-      <w:r>
-        <w:rPr>
-          <w:rFonts w:eastAsia="Times New Roman" w:cs="Times New Roman" w:ascii="Times New Roman" w:hAnsi="Times New Roman"/>
-          <w:b w:val="false"/>
-          <w:i w:val="false"/>
-          <w:caps w:val="false"/>
-          <w:smallCaps w:val="false"/>
-          <w:strike w:val="false"/>
-          <w:dstrike w:val="false"/>
-          <w:color w:val="000000"/>
-          <w:position w:val="0"/>
-          <w:sz w:val="24"/>
-          <w:sz w:val="24"/>
-          <w:szCs w:val="24"/>
-          <w:u w:val="none"/>
-          <w:shd w:fill="auto" w:val="clear"/>
-          <w:vertAlign w:val="baseline"/>
-        </w:rPr>
-        <w:t>ресурсы (/*поставляемые ресурсы3*/) в сум</w:t>
-      </w:r>
-      <w:r>
-        <w:rPr>
-          <w:rFonts w:eastAsia="Times New Roman" w:cs="Times New Roman" w:ascii="Times New Roman" w:hAnsi="Times New Roman"/>
-          <w:b w:val="false"/>
-          <w:i w:val="false"/>
-          <w:caps w:val="false"/>
-          <w:smallCaps w:val="false"/>
-          <w:strike w:val="false"/>
-          <w:dstrike w:val="false"/>
-          <w:color w:val="000000"/>
-          <w:position w:val="0"/>
-          <w:sz w:val="24"/>
-          <w:sz w:val="24"/>
-          <w:szCs w:val="24"/>
-          <w:u w:val="none"/>
-          <w:shd w:fill="auto" w:val="clear"/>
-          <w:vertAlign w:val="baseline"/>
-        </w:rPr>
-        <w:t xml:space="preserve">ме </w:t>
+        <w:t xml:space="preserve">за потребленные ресурсы (/*поставляемые ресурсы3*/) в сумме </w:t>
       </w:r>
       <w:r>
         <w:rPr>
@@ -1975,63 +1963,7 @@
           <w:shd w:fill="auto" w:val="clear"/>
           <w:vertAlign w:val="baseline"/>
         </w:rPr>
-        <w:t xml:space="preserve">Таким образом, Истец свои обязательства по /*мн.ч.2*/ исполнил надлежащим образом и в полном объеме, поставив Ответчику /*поставляемые ресурсы3*/ в соответствии с принятыми на себя обязательствами в отношении количества, качества </w:t>
-        <w:br/>
-        <w:t>и сроков их поставки. Ответчик оплату в полном размере не произвел.</w:t>
-      </w:r>
-    </w:p>
-    <w:p>
-      <w:pPr>
-        <w:pStyle w:val="NoSpacing"/>
-        <w:ind w:firstLine="709"/>
-        <w:jc w:val="both"/>
-        <w:rPr>
-          <w:rFonts w:ascii="Times New Roman" w:hAnsi="Times New Roman" w:cs="Times New Roman"/>
-          <w:sz w:val="24"/>
-          <w:szCs w:val="24"/>
-        </w:rPr>
-      </w:pPr>
-      <w:r>
-        <w:rPr>
-          <w:rFonts w:cs="Times New Roman" w:ascii="Times New Roman" w:hAnsi="Times New Roman"/>
-          <w:sz w:val="24"/>
-          <w:szCs w:val="24"/>
-        </w:rPr>
-        <w:t xml:space="preserve">Как следует из содержания п. 2 ст. 421, ст. 426, п. 4 ст. 445 Гражданского кодекса Российской Федерации (далее - ГК РФ) принуждать потребителя к заключению договора энергоснабжения теплоснабжающая организация не вправе. В тех случаях, когда потребитель пользуется услугами энергоснабжения, однако от заключения договора уклоняется, фактическое пользование абонентом тепловой энергией расценивается </w:t>
-        <w:br/>
-        <w:t>в соответствии с п. 3 ст. 438 ГК РФ как акцепт абонентом оферты.</w:t>
-      </w:r>
-    </w:p>
-    <w:p>
-      <w:pPr>
-        <w:pStyle w:val="NoSpacing"/>
-        <w:ind w:firstLine="709"/>
-        <w:jc w:val="both"/>
-        <w:rPr>
-          <w:rFonts w:ascii="Times New Roman" w:hAnsi="Times New Roman" w:cs="Times New Roman"/>
-          <w:sz w:val="24"/>
-          <w:szCs w:val="24"/>
-        </w:rPr>
-      </w:pPr>
-      <w:r>
-        <w:rPr>
-          <w:rFonts w:eastAsia="Times New Roman" w:cs="Times New Roman" w:ascii="Times New Roman" w:hAnsi="Times New Roman"/>
-          <w:b w:val="false"/>
-          <w:i w:val="false"/>
-          <w:caps w:val="false"/>
-          <w:smallCaps w:val="false"/>
-          <w:strike w:val="false"/>
-          <w:dstrike w:val="false"/>
-          <w:color w:val="000000"/>
-          <w:position w:val="0"/>
-          <w:sz w:val="24"/>
-          <w:sz w:val="24"/>
-          <w:szCs w:val="24"/>
-          <w:u w:val="none"/>
-          <w:shd w:fill="auto" w:val="clear"/>
-          <w:vertAlign w:val="baseline"/>
-        </w:rPr>
-        <w:t>Согласно п. 3 Информационного письма Президиума ВАС РФ от 17.02.1998 г. № 30 «Обзор практики разрешения споров, связанных с договором энергоснабжения» отсутствие договорных отношений с организацией, чьи теплопотребляющие установки присоединены к сетям энергоснабжающей организации не освобождает потребителя обязанности возместить стоимость отпущенной ему тепловой энергии.</w:t>
+        <w:t>Таким образом, Истец свои обязательства по /*мн.ч.2*/ исполнил надлежащим образом и в полном объеме, поставив Ответчику /*поставляемые ресурсы3*/ в соответствии с принятыми на себя обязательствами в отношении количества, качества и сроков их поставки. Ответчик оплату в полном размере не произвел.</w:t>
       </w:r>
     </w:p>
     <w:p>
@@ -2398,9 +2330,7 @@
           <w:shd w:fill="auto" w:val="clear"/>
           <w:vertAlign w:val="baseline"/>
         </w:rPr>
-        <w:t xml:space="preserve">с предложением погасить образовавшуюся задолженность за ТЭ, которые оставлены Ответчиком без ответа. Задолженность в полном объеме не погашена. Копии претензий, </w:t>
-        <w:br/>
-        <w:t>а также документация в отношении направления/получения их Ответчиком, соблюдения претензионного порядка прилагаются к настоящему иску.</w:t>
+        <w:t>с предложением погасить образовавшуюся задолженность за /*поставляемые ресурсы4*/, которые оставлены Ответчиком без ответа. Задолженность в полном объеме не погашена. Копии претензий, а также документация в отношении направления/получения их Ответчиком, соблюдения претензионного порядка прилагаются к настоящему иску.</w:t>
       </w:r>
     </w:p>
     <w:p>
@@ -5012,7 +4942,7 @@
     </w:r>
     <w:r>
       <w:rPr/>
-      <w:t>4</w:t>
+      <w:t>3</w:t>
     </w:r>
     <w:r>
       <w:rPr/>
@@ -5073,7 +5003,7 @@
     </w:r>
     <w:r>
       <w:rPr/>
-      <w:t>4</w:t>
+      <w:t>3</w:t>
     </w:r>
     <w:r>
       <w:rPr/>

</xml_diff>

<commit_message>
Add fix in claim.docx template
</commit_message>
<xml_diff>
--- a/data/templates/claim.docx
+++ b/data/templates/claim.docx
@@ -1711,14 +1711,10 @@
           <w:tab w:val="clear" w:pos="720"/>
           <w:tab w:val="left" w:pos="1136" w:leader="none"/>
         </w:tabs>
-        <w:spacing w:lineRule="auto" w:line="271" w:before="0" w:after="0"/>
+        <w:spacing w:lineRule="auto" w:line="240" w:before="0" w:after="0"/>
         <w:ind w:firstLine="709" w:left="0" w:right="0"/>
         <w:jc w:val="both"/>
-        <w:rPr>
-          <w:rFonts w:ascii="Times New Roman" w:hAnsi="Times New Roman"/>
-          <w:sz w:val="24"/>
-          <w:szCs w:val="24"/>
-        </w:rPr>
+        <w:rPr/>
       </w:pPr>
       <w:r>
         <w:rPr>
@@ -1738,9 +1734,7 @@
           <w:shd w:fill="auto" w:val="clear"/>
           <w:vertAlign w:val="baseline"/>
         </w:rPr>
-        <w:t xml:space="preserve">За Ответчиком по /*мн.ч.6*/ образовалась задолженность </w:t>
-        <w:br/>
-        <w:t xml:space="preserve">за потребленные ресурсы (/*поставляемые ресурсы3*/) в сумме </w:t>
+        <w:t xml:space="preserve">За Ответчиком по /*мн.ч.6*/ образовалась задолженность за потребленные ресурсы (/*поставляемые ресурсы3*/) в сумме </w:t>
       </w:r>
       <w:r>
         <w:rPr>
@@ -3629,7 +3623,7 @@
           <w:shd w:fill="auto" w:val="clear"/>
           <w:vertAlign w:val="baseline"/>
         </w:rPr>
-        <w:t xml:space="preserve"> с </w:t>
+        <w:t xml:space="preserve"> с Ответчика </w:t>
       </w:r>
       <w:r>
         <w:rPr>
@@ -3713,9 +3707,7 @@
           <w:shd w:fill="auto" w:val="clear"/>
           <w:vertAlign w:val="baseline"/>
         </w:rPr>
-        <w:t xml:space="preserve">) в пользу Публичного акционерного общества «Московская объединенная энергетическая компания» (ОГРН /*истец огрн*/, </w:t>
-        <w:br/>
-        <w:t>ИНН /*истец инн*/) задолженность (основной долг) и неустойку по /*мн.ч.2*/ в общем размере</w:t>
+        <w:t>) в пользу Публичного акционерного общества «Московская объединенная энергетическая компания» (ОГРН /*истец огрн*/, ИНН /*истец инн*/) задолженность (основной долг) и неустойку по /*мн.ч.2*/ в общем размере</w:t>
       </w:r>
       <w:r>
         <w:rPr>
@@ -4081,7 +4073,7 @@
           <w:shd w:fill="auto" w:val="clear"/>
           <w:vertAlign w:val="baseline"/>
         </w:rPr>
-        <w:t>неустойку по день фактического исполнения обязательства, начиная с  /*начальная дата неустойки*/ года, рассчитанную исходя из 1/130 ставки рефинансирования Банка России;</w:t>
+        <w:t>неустойку по день фактического исполнения обязательства, начиная с /*начальная дата неустойки*/ года, рассчитанную исходя из 1/130 ставки рефинансирования Банка России;</w:t>
       </w:r>
     </w:p>
     <w:p>
@@ -4156,7 +4148,7 @@
           <w:shd w:fill="auto" w:val="clear"/>
           <w:vertAlign w:val="baseline"/>
         </w:rPr>
-        <w:t xml:space="preserve"> с /*ответчик полное имя*/ (ОГРН </w:t>
+        <w:t xml:space="preserve"> с Ответчика /*ответчик полное имя*/ (ОГРН </w:t>
       </w:r>
       <w:r>
         <w:rPr>
@@ -4212,9 +4204,7 @@
           <w:shd w:fill="auto" w:val="clear"/>
           <w:vertAlign w:val="baseline"/>
         </w:rPr>
-        <w:t xml:space="preserve">) в пользу Публичного акционерного общества «Московская объединенная энергетическая компания»  (ОГРН /*истец огрн*/, </w:t>
-        <w:br/>
-        <w:t xml:space="preserve">ИНН /*истец инн*/) расходы по оплате государственной пошлины  за подачу настоящего иска </w:t>
+        <w:t xml:space="preserve">) в пользу Публичного акционерного общества «Московская объединенная энергетическая компания»  (ОГРН /*истец огрн*/, ИНН /*истец инн*/) расходы по оплате государственной пошлины  за подачу настоящего иска </w:t>
       </w:r>
       <w:r>
         <w:rPr>

</xml_diff>

<commit_message>
make double borders in tables
</commit_message>
<xml_diff>
--- a/data/templates/claim.docx
+++ b/data/templates/claim.docx
@@ -1075,14 +1075,14 @@
         <w:tc>
           <w:tcPr>
             <w:tcW w:w="1962" w:type="dxa"/>
-            <w:tcBorders>
-              <w:top w:val="single" w:sz="6" w:space="0" w:color="000000"/>
-              <w:left w:val="single" w:sz="6" w:space="0" w:color="000000"/>
-              <w:bottom w:val="single" w:sz="6" w:space="0" w:color="000000"/>
-              <w:right w:val="single" w:sz="6" w:space="0" w:color="000000"/>
-            </w:tcBorders>
             <w:shd w:fill="FFFFFF" w:val="clear"/>
             <w:vAlign w:val="center"/>
+            <w:tcBorders>
+              <w:top w:val="double" w:sz="6" w:space="0" w:color="auto"/>
+              <w:left w:val="double" w:sz="6" w:space="0" w:color="auto"/>
+              <w:bottom w:val="double" w:sz="6" w:space="0" w:color="auto"/>
+              <w:right w:val="double" w:sz="6" w:space="0" w:color="auto"/>
+            </w:tcBorders>
           </w:tcPr>
           <w:p>
             <w:pPr>
@@ -1106,13 +1106,14 @@
         <w:tc>
           <w:tcPr>
             <w:tcW w:w="1843" w:type="dxa"/>
-            <w:tcBorders>
-              <w:top w:val="single" w:sz="6" w:space="0" w:color="000000"/>
-              <w:bottom w:val="single" w:sz="6" w:space="0" w:color="000000"/>
-              <w:right w:val="single" w:sz="6" w:space="0" w:color="000000"/>
-            </w:tcBorders>
             <w:shd w:fill="FFFFFF" w:val="clear"/>
             <w:vAlign w:val="center"/>
+            <w:tcBorders>
+              <w:top w:val="double" w:sz="6" w:space="0" w:color="auto"/>
+              <w:left w:val="nil"/>
+              <w:bottom w:val="double" w:sz="6" w:space="0" w:color="auto"/>
+              <w:right w:val="double" w:sz="6" w:space="0" w:color="auto"/>
+            </w:tcBorders>
           </w:tcPr>
           <w:p>
             <w:pPr>
@@ -1136,13 +1137,14 @@
         <w:tc>
           <w:tcPr>
             <w:tcW w:w="2395" w:type="dxa"/>
-            <w:tcBorders>
-              <w:top w:val="single" w:sz="6" w:space="0" w:color="000000"/>
-              <w:bottom w:val="single" w:sz="6" w:space="0" w:color="000000"/>
-              <w:right w:val="single" w:sz="6" w:space="0" w:color="000000"/>
-            </w:tcBorders>
             <w:shd w:fill="FFFFFF" w:val="clear"/>
             <w:vAlign w:val="center"/>
+            <w:tcBorders>
+              <w:top w:val="double" w:sz="6" w:space="0" w:color="auto"/>
+              <w:left w:val="nil"/>
+              <w:bottom w:val="double" w:sz="6" w:space="0" w:color="auto"/>
+              <w:right w:val="double" w:sz="6" w:space="0" w:color="auto"/>
+            </w:tcBorders>
           </w:tcPr>
           <w:p>
             <w:pPr>
@@ -1166,13 +1168,14 @@
         <w:tc>
           <w:tcPr>
             <w:tcW w:w="1840" w:type="dxa"/>
-            <w:tcBorders>
-              <w:top w:val="single" w:sz="6" w:space="0" w:color="000000"/>
-              <w:bottom w:val="single" w:sz="6" w:space="0" w:color="000000"/>
-              <w:right w:val="single" w:sz="6" w:space="0" w:color="000000"/>
-            </w:tcBorders>
             <w:shd w:fill="FFFFFF" w:val="clear"/>
             <w:vAlign w:val="center"/>
+            <w:tcBorders>
+              <w:top w:val="double" w:sz="6" w:space="0" w:color="auto"/>
+              <w:left w:val="nil"/>
+              <w:bottom w:val="double" w:sz="6" w:space="0" w:color="auto"/>
+              <w:right w:val="double" w:sz="6" w:space="0" w:color="auto"/>
+            </w:tcBorders>
           </w:tcPr>
           <w:p>
             <w:pPr>
@@ -1196,13 +1199,14 @@
         <w:tc>
           <w:tcPr>
             <w:tcW w:w="1268" w:type="dxa"/>
-            <w:tcBorders>
-              <w:top w:val="single" w:sz="6" w:space="0" w:color="000000"/>
-              <w:bottom w:val="single" w:sz="6" w:space="0" w:color="000000"/>
-              <w:right w:val="single" w:sz="6" w:space="0" w:color="000000"/>
-            </w:tcBorders>
             <w:shd w:fill="FFFFFF" w:val="clear"/>
             <w:vAlign w:val="center"/>
+            <w:tcBorders>
+              <w:top w:val="double" w:sz="6" w:space="0" w:color="auto"/>
+              <w:left w:val="nil"/>
+              <w:bottom w:val="double" w:sz="6" w:space="0" w:color="auto"/>
+              <w:right w:val="double" w:sz="6" w:space="0" w:color="auto"/>
+            </w:tcBorders>
           </w:tcPr>
           <w:p>
             <w:pPr>
@@ -1232,14 +1236,14 @@
         <w:tc>
           <w:tcPr>
             <w:tcW w:w="1962" w:type="dxa"/>
-            <w:tcBorders>
-              <w:top w:val="single" w:sz="6" w:space="0" w:color="000000"/>
-              <w:left w:val="single" w:sz="6" w:space="0" w:color="000000"/>
-              <w:bottom w:val="single" w:sz="6" w:space="0" w:color="000000"/>
-              <w:right w:val="single" w:sz="6" w:space="0" w:color="000000"/>
-            </w:tcBorders>
             <w:shd w:fill="FFFFFF" w:val="clear"/>
             <w:vAlign w:val="center"/>
+            <w:tcBorders>
+              <w:top w:val="double" w:sz="6" w:space="0" w:color="auto"/>
+              <w:left w:val="double" w:sz="6" w:space="0" w:color="auto"/>
+              <w:bottom w:val="double" w:sz="6" w:space="0" w:color="auto"/>
+              <w:right w:val="double" w:sz="6" w:space="0" w:color="auto"/>
+            </w:tcBorders>
           </w:tcPr>
           <w:p>
             <w:pPr>
@@ -1264,13 +1268,13 @@
         <w:tc>
           <w:tcPr>
             <w:tcW w:w="1843" w:type="dxa"/>
+            <w:vAlign w:val="center"/>
             <w:tcBorders>
-              <w:top w:val="single" w:sz="6" w:space="0" w:color="000000"/>
-              <w:left w:val="single" w:sz="6" w:space="0" w:color="000000"/>
-              <w:bottom w:val="single" w:sz="6" w:space="0" w:color="000000"/>
-              <w:right w:val="single" w:sz="6" w:space="0" w:color="000000"/>
+              <w:top w:val="double" w:sz="6" w:space="0" w:color="auto"/>
+              <w:left w:val="double" w:sz="6" w:space="0" w:color="auto"/>
+              <w:bottom w:val="double" w:sz="6" w:space="0" w:color="auto"/>
+              <w:right w:val="double" w:sz="6" w:space="0" w:color="auto"/>
             </w:tcBorders>
-            <w:vAlign w:val="center"/>
           </w:tcPr>
           <w:p>
             <w:pPr>
@@ -1294,13 +1298,13 @@
         <w:tc>
           <w:tcPr>
             <w:tcW w:w="2395" w:type="dxa"/>
+            <w:vAlign w:val="center"/>
             <w:tcBorders>
-              <w:top w:val="single" w:sz="6" w:space="0" w:color="000000"/>
-              <w:left w:val="single" w:sz="6" w:space="0" w:color="000000"/>
-              <w:bottom w:val="single" w:sz="6" w:space="0" w:color="000000"/>
-              <w:right w:val="single" w:sz="6" w:space="0" w:color="000000"/>
+              <w:top w:val="double" w:sz="6" w:space="0" w:color="auto"/>
+              <w:left w:val="double" w:sz="6" w:space="0" w:color="auto"/>
+              <w:bottom w:val="double" w:sz="6" w:space="0" w:color="auto"/>
+              <w:right w:val="double" w:sz="6" w:space="0" w:color="auto"/>
             </w:tcBorders>
-            <w:vAlign w:val="center"/>
           </w:tcPr>
           <w:p>
             <w:pPr>
@@ -1324,14 +1328,14 @@
         <w:tc>
           <w:tcPr>
             <w:tcW w:w="1840" w:type="dxa"/>
-            <w:tcBorders>
-              <w:top w:val="single" w:sz="6" w:space="0" w:color="000000"/>
-              <w:left w:val="single" w:sz="6" w:space="0" w:color="000000"/>
-              <w:bottom w:val="single" w:sz="6" w:space="0" w:color="000000"/>
-              <w:right w:val="single" w:sz="6" w:space="0" w:color="000000"/>
-            </w:tcBorders>
             <w:shd w:fill="FFFFFF" w:val="clear"/>
             <w:vAlign w:val="center"/>
+            <w:tcBorders>
+              <w:top w:val="double" w:sz="6" w:space="0" w:color="auto"/>
+              <w:left w:val="double" w:sz="6" w:space="0" w:color="auto"/>
+              <w:bottom w:val="double" w:sz="6" w:space="0" w:color="auto"/>
+              <w:right w:val="double" w:sz="6" w:space="0" w:color="auto"/>
+            </w:tcBorders>
           </w:tcPr>
           <w:p>
             <w:pPr>
@@ -1355,14 +1359,14 @@
         <w:tc>
           <w:tcPr>
             <w:tcW w:w="1268" w:type="dxa"/>
-            <w:tcBorders>
-              <w:top w:val="single" w:sz="6" w:space="0" w:color="000000"/>
-              <w:left w:val="single" w:sz="6" w:space="0" w:color="000000"/>
-              <w:bottom w:val="single" w:sz="6" w:space="0" w:color="000000"/>
-              <w:right w:val="single" w:sz="6" w:space="0" w:color="000000"/>
-            </w:tcBorders>
             <w:shd w:fill="FFFFFF" w:val="clear"/>
             <w:vAlign w:val="center"/>
+            <w:tcBorders>
+              <w:top w:val="double" w:sz="6" w:space="0" w:color="auto"/>
+              <w:left w:val="double" w:sz="6" w:space="0" w:color="auto"/>
+              <w:bottom w:val="double" w:sz="6" w:space="0" w:color="auto"/>
+              <w:right w:val="double" w:sz="6" w:space="0" w:color="auto"/>
+            </w:tcBorders>
           </w:tcPr>
           <w:p>
             <w:pPr>
@@ -1429,14 +1433,14 @@
           <w:tcPr>
             <w:tcW w:w="3805" w:type="dxa"/>
             <w:gridSpan w:val="2"/>
-            <w:tcBorders>
-              <w:top w:val="single" w:sz="6" w:space="0" w:color="000000"/>
-              <w:left w:val="single" w:sz="6" w:space="0" w:color="000000"/>
-              <w:bottom w:val="single" w:sz="4" w:space="0" w:color="000000"/>
-              <w:right w:val="single" w:sz="6" w:space="0" w:color="000000"/>
-            </w:tcBorders>
             <w:shd w:fill="FFFFFF" w:val="clear"/>
             <w:vAlign w:val="center"/>
+            <w:tcBorders>
+              <w:top w:val="double" w:sz="6" w:space="0" w:color="auto"/>
+              <w:left w:val="double" w:sz="6" w:space="0" w:color="auto"/>
+              <w:bottom w:val="double" w:sz="6" w:space="0" w:color="auto"/>
+              <w:right w:val="double" w:sz="6" w:space="0" w:color="auto"/>
+            </w:tcBorders>
           </w:tcPr>
           <w:p>
             <w:pPr>
@@ -1460,13 +1464,14 @@
         <w:tc>
           <w:tcPr>
             <w:tcW w:w="2395" w:type="dxa"/>
-            <w:tcBorders>
-              <w:top w:val="single" w:sz="6" w:space="0" w:color="000000"/>
-              <w:bottom w:val="single" w:sz="4" w:space="0" w:color="000000"/>
-              <w:right w:val="single" w:sz="6" w:space="0" w:color="000000"/>
-            </w:tcBorders>
             <w:shd w:fill="FFFFFF" w:val="clear"/>
             <w:vAlign w:val="center"/>
+            <w:tcBorders>
+              <w:top w:val="double" w:sz="6" w:space="0" w:color="auto"/>
+              <w:left w:val="double" w:sz="6" w:space="0" w:color="auto"/>
+              <w:bottom w:val="double" w:sz="6" w:space="0" w:color="auto"/>
+              <w:right w:val="double" w:sz="6" w:space="0" w:color="auto"/>
+            </w:tcBorders>
           </w:tcPr>
           <w:p>
             <w:pPr>
@@ -1491,12 +1496,13 @@
           <w:tcPr>
             <w:tcW w:w="3108" w:type="dxa"/>
             <w:gridSpan w:val="2"/>
+            <w:shd w:fill="FFFFFF" w:val="clear"/>
             <w:tcBorders>
-              <w:top w:val="single" w:sz="6" w:space="0" w:color="000000"/>
-              <w:bottom w:val="single" w:sz="4" w:space="0" w:color="000000"/>
-              <w:right w:val="single" w:sz="6" w:space="0" w:color="000000"/>
+              <w:top w:val="double" w:sz="6" w:space="0" w:color="auto"/>
+              <w:left w:val="double" w:sz="6" w:space="0" w:color="auto"/>
+              <w:bottom w:val="double" w:sz="6" w:space="0" w:color="auto"/>
+              <w:right w:val="double" w:sz="6" w:space="0" w:color="auto"/>
             </w:tcBorders>
-            <w:shd w:fill="FFFFFF" w:val="clear"/>
           </w:tcPr>
           <w:p>
             <w:pPr>
@@ -2634,13 +2640,13 @@
         <w:tc>
           <w:tcPr>
             <w:tcW w:w="2110" w:type="dxa"/>
+            <w:vAlign w:val="center"/>
             <w:tcBorders>
-              <w:top w:val="single" w:sz="4" w:space="0" w:color="000000"/>
-              <w:left w:val="single" w:sz="4" w:space="0" w:color="000000"/>
-              <w:bottom w:val="single" w:sz="4" w:space="0" w:color="000000"/>
-              <w:right w:val="single" w:sz="4" w:space="0" w:color="000000"/>
+              <w:top w:val="double" w:sz="4" w:space="0" w:color="auto"/>
+              <w:left w:val="double" w:sz="4" w:space="0" w:color="auto"/>
+              <w:bottom w:val="double" w:sz="4" w:space="0" w:color="auto"/>
+              <w:right w:val="double" w:sz="4" w:space="0" w:color="auto"/>
             </w:tcBorders>
-            <w:vAlign w:val="center"/>
           </w:tcPr>
           <w:p>
             <w:pPr>
@@ -2668,13 +2674,13 @@
         <w:tc>
           <w:tcPr>
             <w:tcW w:w="1847" w:type="dxa"/>
+            <w:vAlign w:val="center"/>
             <w:tcBorders>
-              <w:top w:val="single" w:sz="4" w:space="0" w:color="000000"/>
-              <w:left w:val="single" w:sz="4" w:space="0" w:color="000000"/>
-              <w:bottom w:val="single" w:sz="4" w:space="0" w:color="000000"/>
-              <w:right w:val="single" w:sz="4" w:space="0" w:color="000000"/>
+              <w:top w:val="double" w:sz="4" w:space="0" w:color="auto"/>
+              <w:left w:val="double" w:sz="4" w:space="0" w:color="auto"/>
+              <w:bottom w:val="double" w:sz="4" w:space="0" w:color="auto"/>
+              <w:right w:val="double" w:sz="4" w:space="0" w:color="auto"/>
             </w:tcBorders>
-            <w:vAlign w:val="center"/>
           </w:tcPr>
           <w:p>
             <w:pPr>
@@ -2702,13 +2708,13 @@
         <w:tc>
           <w:tcPr>
             <w:tcW w:w="1698" w:type="dxa"/>
+            <w:vAlign w:val="center"/>
             <w:tcBorders>
-              <w:top w:val="single" w:sz="4" w:space="0" w:color="000000"/>
-              <w:left w:val="single" w:sz="4" w:space="0" w:color="000000"/>
-              <w:bottom w:val="single" w:sz="4" w:space="0" w:color="000000"/>
-              <w:right w:val="single" w:sz="4" w:space="0" w:color="000000"/>
+              <w:top w:val="double" w:sz="4" w:space="0" w:color="auto"/>
+              <w:left w:val="double" w:sz="4" w:space="0" w:color="auto"/>
+              <w:bottom w:val="double" w:sz="4" w:space="0" w:color="auto"/>
+              <w:right w:val="double" w:sz="4" w:space="0" w:color="auto"/>
             </w:tcBorders>
-            <w:vAlign w:val="center"/>
           </w:tcPr>
           <w:p>
             <w:pPr>
@@ -2736,13 +2742,13 @@
         <w:tc>
           <w:tcPr>
             <w:tcW w:w="1420" w:type="dxa"/>
+            <w:vAlign w:val="center"/>
             <w:tcBorders>
-              <w:top w:val="single" w:sz="4" w:space="0" w:color="000000"/>
-              <w:left w:val="single" w:sz="4" w:space="0" w:color="000000"/>
-              <w:bottom w:val="single" w:sz="4" w:space="0" w:color="000000"/>
-              <w:right w:val="single" w:sz="4" w:space="0" w:color="000000"/>
+              <w:top w:val="double" w:sz="4" w:space="0" w:color="auto"/>
+              <w:left w:val="double" w:sz="4" w:space="0" w:color="auto"/>
+              <w:bottom w:val="double" w:sz="4" w:space="0" w:color="auto"/>
+              <w:right w:val="double" w:sz="4" w:space="0" w:color="auto"/>
             </w:tcBorders>
-            <w:vAlign w:val="center"/>
           </w:tcPr>
           <w:p>
             <w:pPr>
@@ -2792,13 +2798,13 @@
         <w:tc>
           <w:tcPr>
             <w:tcW w:w="2249" w:type="dxa"/>
+            <w:vAlign w:val="center"/>
             <w:tcBorders>
-              <w:top w:val="single" w:sz="4" w:space="0" w:color="000000"/>
-              <w:left w:val="single" w:sz="4" w:space="0" w:color="000000"/>
-              <w:bottom w:val="single" w:sz="4" w:space="0" w:color="000000"/>
-              <w:right w:val="single" w:sz="4" w:space="0" w:color="000000"/>
+              <w:top w:val="double" w:sz="4" w:space="0" w:color="auto"/>
+              <w:left w:val="double" w:sz="4" w:space="0" w:color="auto"/>
+              <w:bottom w:val="double" w:sz="4" w:space="0" w:color="auto"/>
+              <w:right w:val="double" w:sz="4" w:space="0" w:color="auto"/>
             </w:tcBorders>
-            <w:vAlign w:val="center"/>
           </w:tcPr>
           <w:p>
             <w:pPr>
@@ -2853,13 +2859,13 @@
         <w:tc>
           <w:tcPr>
             <w:tcW w:w="2110" w:type="dxa"/>
+            <w:vAlign w:val="center"/>
             <w:tcBorders>
-              <w:top w:val="single" w:sz="4" w:space="0" w:color="000000"/>
-              <w:left w:val="single" w:sz="4" w:space="0" w:color="000000"/>
-              <w:bottom w:val="single" w:sz="4" w:space="0" w:color="000000"/>
-              <w:right w:val="single" w:sz="4" w:space="0" w:color="000000"/>
+              <w:top w:val="double" w:sz="4" w:space="0" w:color="auto"/>
+              <w:left w:val="double" w:sz="4" w:space="0" w:color="auto"/>
+              <w:bottom w:val="double" w:sz="4" w:space="0" w:color="auto"/>
+              <w:right w:val="double" w:sz="4" w:space="0" w:color="auto"/>
             </w:tcBorders>
-            <w:vAlign w:val="center"/>
           </w:tcPr>
           <w:p>
             <w:pPr>
@@ -2884,13 +2890,13 @@
         <w:tc>
           <w:tcPr>
             <w:tcW w:w="1847" w:type="dxa"/>
+            <w:vAlign w:val="center"/>
             <w:tcBorders>
-              <w:top w:val="single" w:sz="4" w:space="0" w:color="000000"/>
-              <w:left w:val="single" w:sz="4" w:space="0" w:color="000000"/>
-              <w:bottom w:val="single" w:sz="4" w:space="0" w:color="000000"/>
-              <w:right w:val="single" w:sz="4" w:space="0" w:color="000000"/>
+              <w:top w:val="double" w:sz="4" w:space="0" w:color="auto"/>
+              <w:left w:val="double" w:sz="4" w:space="0" w:color="auto"/>
+              <w:bottom w:val="double" w:sz="4" w:space="0" w:color="auto"/>
+              <w:right w:val="double" w:sz="4" w:space="0" w:color="auto"/>
             </w:tcBorders>
-            <w:vAlign w:val="center"/>
           </w:tcPr>
           <w:p>
             <w:pPr>
@@ -2914,13 +2920,13 @@
         <w:tc>
           <w:tcPr>
             <w:tcW w:w="1698" w:type="dxa"/>
+            <w:vAlign w:val="center"/>
             <w:tcBorders>
-              <w:top w:val="single" w:sz="4" w:space="0" w:color="000000"/>
-              <w:left w:val="single" w:sz="4" w:space="0" w:color="000000"/>
-              <w:bottom w:val="single" w:sz="4" w:space="0" w:color="000000"/>
-              <w:right w:val="single" w:sz="4" w:space="0" w:color="000000"/>
+              <w:top w:val="double" w:sz="4" w:space="0" w:color="auto"/>
+              <w:left w:val="double" w:sz="4" w:space="0" w:color="auto"/>
+              <w:bottom w:val="double" w:sz="4" w:space="0" w:color="auto"/>
+              <w:right w:val="double" w:sz="4" w:space="0" w:color="auto"/>
             </w:tcBorders>
-            <w:vAlign w:val="center"/>
           </w:tcPr>
           <w:p>
             <w:pPr>
@@ -2944,13 +2950,13 @@
         <w:tc>
           <w:tcPr>
             <w:tcW w:w="1420" w:type="dxa"/>
+            <w:vAlign w:val="center"/>
             <w:tcBorders>
-              <w:top w:val="single" w:sz="4" w:space="0" w:color="000000"/>
-              <w:left w:val="single" w:sz="4" w:space="0" w:color="000000"/>
-              <w:bottom w:val="single" w:sz="4" w:space="0" w:color="000000"/>
-              <w:right w:val="single" w:sz="4" w:space="0" w:color="000000"/>
+              <w:top w:val="double" w:sz="4" w:space="0" w:color="auto"/>
+              <w:left w:val="double" w:sz="4" w:space="0" w:color="auto"/>
+              <w:bottom w:val="double" w:sz="4" w:space="0" w:color="auto"/>
+              <w:right w:val="double" w:sz="4" w:space="0" w:color="auto"/>
             </w:tcBorders>
-            <w:vAlign w:val="center"/>
           </w:tcPr>
           <w:p>
             <w:pPr>
@@ -2974,13 +2980,13 @@
         <w:tc>
           <w:tcPr>
             <w:tcW w:w="2249" w:type="dxa"/>
+            <w:vAlign w:val="center"/>
             <w:tcBorders>
-              <w:top w:val="single" w:sz="4" w:space="0" w:color="000000"/>
-              <w:left w:val="single" w:sz="4" w:space="0" w:color="000000"/>
-              <w:bottom w:val="single" w:sz="4" w:space="0" w:color="000000"/>
-              <w:right w:val="single" w:sz="4" w:space="0" w:color="000000"/>
+              <w:top w:val="double" w:sz="4" w:space="0" w:color="auto"/>
+              <w:left w:val="double" w:sz="4" w:space="0" w:color="auto"/>
+              <w:bottom w:val="double" w:sz="4" w:space="0" w:color="auto"/>
+              <w:right w:val="double" w:sz="4" w:space="0" w:color="auto"/>
             </w:tcBorders>
-            <w:vAlign w:val="center"/>
           </w:tcPr>
           <w:p>
             <w:pPr>
@@ -3010,13 +3016,13 @@
           <w:tcPr>
             <w:tcW w:w="3957" w:type="dxa"/>
             <w:gridSpan w:val="2"/>
+            <w:vAlign w:val="center"/>
             <w:tcBorders>
-              <w:top w:val="single" w:sz="4" w:space="0" w:color="000000"/>
-              <w:left w:val="single" w:sz="4" w:space="0" w:color="000000"/>
-              <w:bottom w:val="single" w:sz="4" w:space="0" w:color="000000"/>
-              <w:right w:val="single" w:sz="4" w:space="0" w:color="000000"/>
+              <w:top w:val="double" w:sz="4" w:space="0" w:color="auto"/>
+              <w:left w:val="double" w:sz="4" w:space="0" w:color="auto"/>
+              <w:bottom w:val="double" w:sz="4" w:space="0" w:color="auto"/>
+              <w:right w:val="double" w:sz="4" w:space="0" w:color="auto"/>
             </w:tcBorders>
-            <w:vAlign w:val="center"/>
           </w:tcPr>
           <w:p>
             <w:pPr>
@@ -3040,13 +3046,13 @@
         <w:tc>
           <w:tcPr>
             <w:tcW w:w="1698" w:type="dxa"/>
+            <w:vAlign w:val="center"/>
             <w:tcBorders>
-              <w:top w:val="single" w:sz="4" w:space="0" w:color="000000"/>
-              <w:left w:val="single" w:sz="4" w:space="0" w:color="000000"/>
-              <w:bottom w:val="single" w:sz="4" w:space="0" w:color="000000"/>
-              <w:right w:val="single" w:sz="4" w:space="0" w:color="000000"/>
+              <w:top w:val="double" w:sz="4" w:space="0" w:color="auto"/>
+              <w:left w:val="double" w:sz="4" w:space="0" w:color="auto"/>
+              <w:bottom w:val="double" w:sz="4" w:space="0" w:color="auto"/>
+              <w:right w:val="double" w:sz="4" w:space="0" w:color="auto"/>
             </w:tcBorders>
-            <w:vAlign w:val="center"/>
           </w:tcPr>
           <w:p>
             <w:pPr>
@@ -3070,13 +3076,13 @@
         <w:tc>
           <w:tcPr>
             <w:tcW w:w="1420" w:type="dxa"/>
+            <w:vAlign w:val="center"/>
             <w:tcBorders>
-              <w:top w:val="single" w:sz="4" w:space="0" w:color="000000"/>
-              <w:left w:val="single" w:sz="4" w:space="0" w:color="000000"/>
-              <w:bottom w:val="single" w:sz="4" w:space="0" w:color="000000"/>
-              <w:right w:val="single" w:sz="4" w:space="0" w:color="000000"/>
+              <w:top w:val="double" w:sz="4" w:space="0" w:color="auto"/>
+              <w:left w:val="double" w:sz="4" w:space="0" w:color="auto"/>
+              <w:bottom w:val="double" w:sz="4" w:space="0" w:color="auto"/>
+              <w:right w:val="double" w:sz="4" w:space="0" w:color="auto"/>
             </w:tcBorders>
-            <w:vAlign w:val="center"/>
           </w:tcPr>
           <w:p>
             <w:pPr>
@@ -3100,13 +3106,13 @@
         <w:tc>
           <w:tcPr>
             <w:tcW w:w="2249" w:type="dxa"/>
+            <w:vAlign w:val="center"/>
             <w:tcBorders>
-              <w:top w:val="single" w:sz="4" w:space="0" w:color="000000"/>
-              <w:left w:val="single" w:sz="4" w:space="0" w:color="000000"/>
-              <w:bottom w:val="single" w:sz="4" w:space="0" w:color="000000"/>
-              <w:right w:val="single" w:sz="4" w:space="0" w:color="000000"/>
+              <w:top w:val="double" w:sz="4" w:space="0" w:color="auto"/>
+              <w:left w:val="double" w:sz="4" w:space="0" w:color="auto"/>
+              <w:bottom w:val="double" w:sz="4" w:space="0" w:color="auto"/>
+              <w:right w:val="double" w:sz="4" w:space="0" w:color="auto"/>
             </w:tcBorders>
-            <w:vAlign w:val="center"/>
           </w:tcPr>
           <w:p>
             <w:pPr>
@@ -3713,9 +3719,7 @@
           <w:shd w:fill="auto" w:val="clear"/>
           <w:vertAlign w:val="baseline"/>
         </w:rPr>
-        <w:t xml:space="preserve">) в пользу Публичного акционерного общества «Московская объединенная энергетическая компания» (ОГРН /*истец огрн*/, </w:t>
-        <w:br/>
-        <w:t>ИНН /*истец инн*/) задолженность (основной долг) и неустойку по /*мн.ч.2*/ в общем размере</w:t>
+        <w:t>) в пользу Публичного акционерного общества «Московская объединенная энергетическая компания» (ОГРН /*истец огрн*/, ИНН /*истец инн*/) задолженность (основной долг) и неустойку по /*мн.ч.2*/ в общем размере</w:t>
       </w:r>
       <w:r>
         <w:rPr>
@@ -4212,9 +4216,7 @@
           <w:shd w:fill="auto" w:val="clear"/>
           <w:vertAlign w:val="baseline"/>
         </w:rPr>
-        <w:t xml:space="preserve">) в пользу Публичного акционерного общества «Московская объединенная энергетическая компания»  (ОГРН /*истец огрн*/, </w:t>
-        <w:br/>
-        <w:t xml:space="preserve">ИНН /*истец инн*/) расходы по оплате государственной пошлины  за подачу настоящего иска </w:t>
+        <w:t xml:space="preserve">) в пользу Публичного акционерного общества «Московская объединенная энергетическая компания» (ОГРН /*истец огрн*/, ИНН /*истец инн*/) расходы по оплате государственной пошлины  за подачу настоящего иска </w:t>
       </w:r>
       <w:r>
         <w:rPr>

</xml_diff>

<commit_message>
make plural form for claims
</commit_message>
<xml_diff>
--- a/data/templates/claim.docx
+++ b/data/templates/claim.docx
@@ -1075,14 +1075,14 @@
         <w:tc>
           <w:tcPr>
             <w:tcW w:w="1962" w:type="dxa"/>
+            <w:tcBorders>
+              <w:top w:val="double" w:sz="6" w:space="0" w:color="000000"/>
+              <w:left w:val="double" w:sz="6" w:space="0" w:color="000000"/>
+              <w:bottom w:val="double" w:sz="6" w:space="0" w:color="000000"/>
+              <w:right w:val="double" w:sz="6" w:space="0" w:color="000000"/>
+            </w:tcBorders>
             <w:shd w:fill="FFFFFF" w:val="clear"/>
             <w:vAlign w:val="center"/>
-            <w:tcBorders>
-              <w:top w:val="double" w:sz="6" w:space="0" w:color="auto"/>
-              <w:left w:val="double" w:sz="6" w:space="0" w:color="auto"/>
-              <w:bottom w:val="double" w:sz="6" w:space="0" w:color="auto"/>
-              <w:right w:val="double" w:sz="6" w:space="0" w:color="auto"/>
-            </w:tcBorders>
           </w:tcPr>
           <w:p>
             <w:pPr>
@@ -1106,14 +1106,13 @@
         <w:tc>
           <w:tcPr>
             <w:tcW w:w="1843" w:type="dxa"/>
+            <w:tcBorders>
+              <w:top w:val="double" w:sz="6" w:space="0" w:color="000000"/>
+              <w:bottom w:val="double" w:sz="6" w:space="0" w:color="000000"/>
+              <w:right w:val="double" w:sz="6" w:space="0" w:color="000000"/>
+            </w:tcBorders>
             <w:shd w:fill="FFFFFF" w:val="clear"/>
             <w:vAlign w:val="center"/>
-            <w:tcBorders>
-              <w:top w:val="double" w:sz="6" w:space="0" w:color="auto"/>
-              <w:left w:val="nil"/>
-              <w:bottom w:val="double" w:sz="6" w:space="0" w:color="auto"/>
-              <w:right w:val="double" w:sz="6" w:space="0" w:color="auto"/>
-            </w:tcBorders>
           </w:tcPr>
           <w:p>
             <w:pPr>
@@ -1137,14 +1136,13 @@
         <w:tc>
           <w:tcPr>
             <w:tcW w:w="2395" w:type="dxa"/>
+            <w:tcBorders>
+              <w:top w:val="double" w:sz="6" w:space="0" w:color="000000"/>
+              <w:bottom w:val="double" w:sz="6" w:space="0" w:color="000000"/>
+              <w:right w:val="double" w:sz="6" w:space="0" w:color="000000"/>
+            </w:tcBorders>
             <w:shd w:fill="FFFFFF" w:val="clear"/>
             <w:vAlign w:val="center"/>
-            <w:tcBorders>
-              <w:top w:val="double" w:sz="6" w:space="0" w:color="auto"/>
-              <w:left w:val="nil"/>
-              <w:bottom w:val="double" w:sz="6" w:space="0" w:color="auto"/>
-              <w:right w:val="double" w:sz="6" w:space="0" w:color="auto"/>
-            </w:tcBorders>
           </w:tcPr>
           <w:p>
             <w:pPr>
@@ -1168,14 +1166,13 @@
         <w:tc>
           <w:tcPr>
             <w:tcW w:w="1840" w:type="dxa"/>
+            <w:tcBorders>
+              <w:top w:val="double" w:sz="6" w:space="0" w:color="000000"/>
+              <w:bottom w:val="double" w:sz="6" w:space="0" w:color="000000"/>
+              <w:right w:val="double" w:sz="6" w:space="0" w:color="000000"/>
+            </w:tcBorders>
             <w:shd w:fill="FFFFFF" w:val="clear"/>
             <w:vAlign w:val="center"/>
-            <w:tcBorders>
-              <w:top w:val="double" w:sz="6" w:space="0" w:color="auto"/>
-              <w:left w:val="nil"/>
-              <w:bottom w:val="double" w:sz="6" w:space="0" w:color="auto"/>
-              <w:right w:val="double" w:sz="6" w:space="0" w:color="auto"/>
-            </w:tcBorders>
           </w:tcPr>
           <w:p>
             <w:pPr>
@@ -1199,14 +1196,13 @@
         <w:tc>
           <w:tcPr>
             <w:tcW w:w="1268" w:type="dxa"/>
+            <w:tcBorders>
+              <w:top w:val="double" w:sz="6" w:space="0" w:color="000000"/>
+              <w:bottom w:val="double" w:sz="6" w:space="0" w:color="000000"/>
+              <w:right w:val="double" w:sz="6" w:space="0" w:color="000000"/>
+            </w:tcBorders>
             <w:shd w:fill="FFFFFF" w:val="clear"/>
             <w:vAlign w:val="center"/>
-            <w:tcBorders>
-              <w:top w:val="double" w:sz="6" w:space="0" w:color="auto"/>
-              <w:left w:val="nil"/>
-              <w:bottom w:val="double" w:sz="6" w:space="0" w:color="auto"/>
-              <w:right w:val="double" w:sz="6" w:space="0" w:color="auto"/>
-            </w:tcBorders>
           </w:tcPr>
           <w:p>
             <w:pPr>
@@ -1236,14 +1232,14 @@
         <w:tc>
           <w:tcPr>
             <w:tcW w:w="1962" w:type="dxa"/>
+            <w:tcBorders>
+              <w:top w:val="double" w:sz="6" w:space="0" w:color="000000"/>
+              <w:left w:val="double" w:sz="6" w:space="0" w:color="000000"/>
+              <w:bottom w:val="double" w:sz="6" w:space="0" w:color="000000"/>
+              <w:right w:val="double" w:sz="6" w:space="0" w:color="000000"/>
+            </w:tcBorders>
             <w:shd w:fill="FFFFFF" w:val="clear"/>
             <w:vAlign w:val="center"/>
-            <w:tcBorders>
-              <w:top w:val="double" w:sz="6" w:space="0" w:color="auto"/>
-              <w:left w:val="double" w:sz="6" w:space="0" w:color="auto"/>
-              <w:bottom w:val="double" w:sz="6" w:space="0" w:color="auto"/>
-              <w:right w:val="double" w:sz="6" w:space="0" w:color="auto"/>
-            </w:tcBorders>
           </w:tcPr>
           <w:p>
             <w:pPr>
@@ -1268,13 +1264,13 @@
         <w:tc>
           <w:tcPr>
             <w:tcW w:w="1843" w:type="dxa"/>
+            <w:tcBorders>
+              <w:top w:val="double" w:sz="6" w:space="0" w:color="000000"/>
+              <w:left w:val="double" w:sz="6" w:space="0" w:color="000000"/>
+              <w:bottom w:val="double" w:sz="6" w:space="0" w:color="000000"/>
+              <w:right w:val="double" w:sz="6" w:space="0" w:color="000000"/>
+            </w:tcBorders>
             <w:vAlign w:val="center"/>
-            <w:tcBorders>
-              <w:top w:val="double" w:sz="6" w:space="0" w:color="auto"/>
-              <w:left w:val="double" w:sz="6" w:space="0" w:color="auto"/>
-              <w:bottom w:val="double" w:sz="6" w:space="0" w:color="auto"/>
-              <w:right w:val="double" w:sz="6" w:space="0" w:color="auto"/>
-            </w:tcBorders>
           </w:tcPr>
           <w:p>
             <w:pPr>
@@ -1298,13 +1294,13 @@
         <w:tc>
           <w:tcPr>
             <w:tcW w:w="2395" w:type="dxa"/>
+            <w:tcBorders>
+              <w:top w:val="double" w:sz="6" w:space="0" w:color="000000"/>
+              <w:left w:val="double" w:sz="6" w:space="0" w:color="000000"/>
+              <w:bottom w:val="double" w:sz="6" w:space="0" w:color="000000"/>
+              <w:right w:val="double" w:sz="6" w:space="0" w:color="000000"/>
+            </w:tcBorders>
             <w:vAlign w:val="center"/>
-            <w:tcBorders>
-              <w:top w:val="double" w:sz="6" w:space="0" w:color="auto"/>
-              <w:left w:val="double" w:sz="6" w:space="0" w:color="auto"/>
-              <w:bottom w:val="double" w:sz="6" w:space="0" w:color="auto"/>
-              <w:right w:val="double" w:sz="6" w:space="0" w:color="auto"/>
-            </w:tcBorders>
           </w:tcPr>
           <w:p>
             <w:pPr>
@@ -1328,14 +1324,14 @@
         <w:tc>
           <w:tcPr>
             <w:tcW w:w="1840" w:type="dxa"/>
+            <w:tcBorders>
+              <w:top w:val="double" w:sz="6" w:space="0" w:color="000000"/>
+              <w:left w:val="double" w:sz="6" w:space="0" w:color="000000"/>
+              <w:bottom w:val="double" w:sz="6" w:space="0" w:color="000000"/>
+              <w:right w:val="double" w:sz="6" w:space="0" w:color="000000"/>
+            </w:tcBorders>
             <w:shd w:fill="FFFFFF" w:val="clear"/>
             <w:vAlign w:val="center"/>
-            <w:tcBorders>
-              <w:top w:val="double" w:sz="6" w:space="0" w:color="auto"/>
-              <w:left w:val="double" w:sz="6" w:space="0" w:color="auto"/>
-              <w:bottom w:val="double" w:sz="6" w:space="0" w:color="auto"/>
-              <w:right w:val="double" w:sz="6" w:space="0" w:color="auto"/>
-            </w:tcBorders>
           </w:tcPr>
           <w:p>
             <w:pPr>
@@ -1359,14 +1355,14 @@
         <w:tc>
           <w:tcPr>
             <w:tcW w:w="1268" w:type="dxa"/>
+            <w:tcBorders>
+              <w:top w:val="double" w:sz="6" w:space="0" w:color="000000"/>
+              <w:left w:val="double" w:sz="6" w:space="0" w:color="000000"/>
+              <w:bottom w:val="double" w:sz="6" w:space="0" w:color="000000"/>
+              <w:right w:val="double" w:sz="6" w:space="0" w:color="000000"/>
+            </w:tcBorders>
             <w:shd w:fill="FFFFFF" w:val="clear"/>
             <w:vAlign w:val="center"/>
-            <w:tcBorders>
-              <w:top w:val="double" w:sz="6" w:space="0" w:color="auto"/>
-              <w:left w:val="double" w:sz="6" w:space="0" w:color="auto"/>
-              <w:bottom w:val="double" w:sz="6" w:space="0" w:color="auto"/>
-              <w:right w:val="double" w:sz="6" w:space="0" w:color="auto"/>
-            </w:tcBorders>
           </w:tcPr>
           <w:p>
             <w:pPr>
@@ -1433,14 +1429,14 @@
           <w:tcPr>
             <w:tcW w:w="3805" w:type="dxa"/>
             <w:gridSpan w:val="2"/>
+            <w:tcBorders>
+              <w:top w:val="double" w:sz="6" w:space="0" w:color="000000"/>
+              <w:left w:val="double" w:sz="6" w:space="0" w:color="000000"/>
+              <w:bottom w:val="double" w:sz="6" w:space="0" w:color="000000"/>
+              <w:right w:val="double" w:sz="6" w:space="0" w:color="000000"/>
+            </w:tcBorders>
             <w:shd w:fill="FFFFFF" w:val="clear"/>
             <w:vAlign w:val="center"/>
-            <w:tcBorders>
-              <w:top w:val="double" w:sz="6" w:space="0" w:color="auto"/>
-              <w:left w:val="double" w:sz="6" w:space="0" w:color="auto"/>
-              <w:bottom w:val="double" w:sz="6" w:space="0" w:color="auto"/>
-              <w:right w:val="double" w:sz="6" w:space="0" w:color="auto"/>
-            </w:tcBorders>
           </w:tcPr>
           <w:p>
             <w:pPr>
@@ -1464,14 +1460,14 @@
         <w:tc>
           <w:tcPr>
             <w:tcW w:w="2395" w:type="dxa"/>
+            <w:tcBorders>
+              <w:top w:val="double" w:sz="6" w:space="0" w:color="000000"/>
+              <w:left w:val="double" w:sz="6" w:space="0" w:color="000000"/>
+              <w:bottom w:val="double" w:sz="6" w:space="0" w:color="000000"/>
+              <w:right w:val="double" w:sz="6" w:space="0" w:color="000000"/>
+            </w:tcBorders>
             <w:shd w:fill="FFFFFF" w:val="clear"/>
             <w:vAlign w:val="center"/>
-            <w:tcBorders>
-              <w:top w:val="double" w:sz="6" w:space="0" w:color="auto"/>
-              <w:left w:val="double" w:sz="6" w:space="0" w:color="auto"/>
-              <w:bottom w:val="double" w:sz="6" w:space="0" w:color="auto"/>
-              <w:right w:val="double" w:sz="6" w:space="0" w:color="auto"/>
-            </w:tcBorders>
           </w:tcPr>
           <w:p>
             <w:pPr>
@@ -1496,13 +1492,13 @@
           <w:tcPr>
             <w:tcW w:w="3108" w:type="dxa"/>
             <w:gridSpan w:val="2"/>
+            <w:tcBorders>
+              <w:top w:val="double" w:sz="6" w:space="0" w:color="000000"/>
+              <w:left w:val="double" w:sz="6" w:space="0" w:color="000000"/>
+              <w:bottom w:val="double" w:sz="6" w:space="0" w:color="000000"/>
+              <w:right w:val="double" w:sz="6" w:space="0" w:color="000000"/>
+            </w:tcBorders>
             <w:shd w:fill="FFFFFF" w:val="clear"/>
-            <w:tcBorders>
-              <w:top w:val="double" w:sz="6" w:space="0" w:color="auto"/>
-              <w:left w:val="double" w:sz="6" w:space="0" w:color="auto"/>
-              <w:bottom w:val="double" w:sz="6" w:space="0" w:color="auto"/>
-              <w:right w:val="double" w:sz="6" w:space="0" w:color="auto"/>
-            </w:tcBorders>
           </w:tcPr>
           <w:p>
             <w:pPr>
@@ -1703,119 +1699,6 @@
           <w:vertAlign w:val="baseline"/>
         </w:rPr>
         <w:t xml:space="preserve">В соответствии с условиями /*мн.ч.4*/ в период, указанный в соответствующей графе вышеизложенной таблицы (далее – Период), Истец поставил Ответчику через присоединенную сеть в соответствии с /*мн.ч.*/ /*тип договора*/, а Ответчик, соответственно, обязан оплатить полученные ресурсы на основании /*мн.ч.5*/ и установленных тарифов для соответствующих групп потребителей. </w:t>
-      </w:r>
-    </w:p>
-    <w:p>
-      <w:pPr>
-        <w:pStyle w:val="normal1"/>
-        <w:keepNext w:val="false"/>
-        <w:keepLines w:val="false"/>
-        <w:pageBreakBefore w:val="false"/>
-        <w:widowControl w:val="false"/>
-        <w:shd w:val="clear" w:fill="auto"/>
-        <w:tabs>
-          <w:tab w:val="clear" w:pos="720"/>
-          <w:tab w:val="left" w:pos="1136" w:leader="none"/>
-        </w:tabs>
-        <w:spacing w:lineRule="auto" w:line="271" w:before="0" w:after="0"/>
-        <w:ind w:firstLine="709" w:left="0" w:right="0"/>
-        <w:jc w:val="both"/>
-        <w:rPr>
-          <w:rFonts w:ascii="Times New Roman" w:hAnsi="Times New Roman"/>
-          <w:sz w:val="24"/>
-          <w:szCs w:val="24"/>
-        </w:rPr>
-      </w:pPr>
-      <w:r>
-        <w:rPr>
-          <w:rFonts w:eastAsia="Times New Roman" w:cs="Times New Roman" w:ascii="Times New Roman" w:hAnsi="Times New Roman"/>
-          <w:b w:val="false"/>
-          <w:i w:val="false"/>
-          <w:caps w:val="false"/>
-          <w:smallCaps w:val="false"/>
-          <w:strike w:val="false"/>
-          <w:dstrike w:val="false"/>
-          <w:color w:val="000000"/>
-          <w:position w:val="0"/>
-          <w:sz w:val="24"/>
-          <w:sz w:val="24"/>
-          <w:szCs w:val="24"/>
-          <w:u w:val="none"/>
-          <w:shd w:fill="auto" w:val="clear"/>
-          <w:vertAlign w:val="baseline"/>
-        </w:rPr>
-        <w:t xml:space="preserve">За Ответчиком по /*мн.ч.6*/ образовалась задолженность </w:t>
-        <w:br/>
-        <w:t xml:space="preserve">за потребленные ресурсы (/*поставляемые ресурсы3*/) в сумме </w:t>
-      </w:r>
-      <w:r>
-        <w:rPr>
-          <w:rFonts w:eastAsia="Times New Roman" w:cs="Times New Roman" w:ascii="Times New Roman" w:hAnsi="Times New Roman"/>
-          <w:b/>
-          <w:sz w:val="24"/>
-          <w:szCs w:val="24"/>
-        </w:rPr>
-        <w:t xml:space="preserve">/*сумма долга*/ </w:t>
-      </w:r>
-      <w:r>
-        <w:rPr>
-          <w:rFonts w:eastAsia="Times New Roman" w:cs="Times New Roman" w:ascii="Times New Roman" w:hAnsi="Times New Roman"/>
-          <w:b w:val="false"/>
-          <w:i w:val="false"/>
-          <w:caps w:val="false"/>
-          <w:smallCaps w:val="false"/>
-          <w:strike w:val="false"/>
-          <w:dstrike w:val="false"/>
-          <w:color w:val="000000"/>
-          <w:position w:val="0"/>
-          <w:sz w:val="24"/>
-          <w:sz w:val="24"/>
-          <w:szCs w:val="24"/>
-          <w:u w:val="none"/>
-          <w:shd w:fill="auto" w:val="clear"/>
-          <w:vertAlign w:val="baseline"/>
-        </w:rPr>
-        <w:t>рублей</w:t>
-      </w:r>
-      <w:r>
-        <w:rPr>
-          <w:rFonts w:eastAsia="Times New Roman" w:cs="Times New Roman" w:ascii="Times New Roman" w:hAnsi="Times New Roman"/>
-          <w:b/>
-          <w:i w:val="false"/>
-          <w:caps w:val="false"/>
-          <w:smallCaps w:val="false"/>
-          <w:strike w:val="false"/>
-          <w:dstrike w:val="false"/>
-          <w:color w:val="000000"/>
-          <w:position w:val="0"/>
-          <w:sz w:val="24"/>
-          <w:sz w:val="24"/>
-          <w:szCs w:val="24"/>
-          <w:u w:val="none"/>
-          <w:shd w:fill="auto" w:val="clear"/>
-          <w:vertAlign w:val="baseline"/>
-        </w:rPr>
-        <w:t xml:space="preserve"> </w:t>
-      </w:r>
-      <w:r>
-        <w:rPr>
-          <w:rFonts w:eastAsia="Times New Roman" w:cs="Times New Roman" w:ascii="Times New Roman" w:hAnsi="Times New Roman"/>
-          <w:b w:val="false"/>
-          <w:i w:val="false"/>
-          <w:caps w:val="false"/>
-          <w:smallCaps w:val="false"/>
-          <w:strike w:val="false"/>
-          <w:dstrike w:val="false"/>
-          <w:color w:val="000000"/>
-          <w:position w:val="0"/>
-          <w:sz w:val="24"/>
-          <w:sz w:val="24"/>
-          <w:szCs w:val="24"/>
-          <w:u w:val="none"/>
-          <w:shd w:fill="auto" w:val="clear"/>
-          <w:vertAlign w:val="baseline"/>
-        </w:rPr>
-        <w:t>за указанный выше Период.</w:t>
       </w:r>
     </w:p>
     <w:p>
@@ -1833,6 +1716,115 @@
         <w:spacing w:lineRule="auto" w:line="240" w:before="0" w:after="0"/>
         <w:ind w:firstLine="709" w:left="0" w:right="0"/>
         <w:jc w:val="both"/>
+        <w:rPr/>
+      </w:pPr>
+      <w:r>
+        <w:rPr>
+          <w:rFonts w:eastAsia="Times New Roman" w:cs="Times New Roman" w:ascii="Times New Roman" w:hAnsi="Times New Roman"/>
+          <w:b w:val="false"/>
+          <w:i w:val="false"/>
+          <w:caps w:val="false"/>
+          <w:smallCaps w:val="false"/>
+          <w:strike w:val="false"/>
+          <w:dstrike w:val="false"/>
+          <w:color w:val="000000"/>
+          <w:position w:val="0"/>
+          <w:sz w:val="24"/>
+          <w:sz w:val="24"/>
+          <w:szCs w:val="24"/>
+          <w:u w:val="none"/>
+          <w:shd w:fill="auto" w:val="clear"/>
+          <w:vertAlign w:val="baseline"/>
+        </w:rPr>
+        <w:t xml:space="preserve">За Ответчиком по /*мн.ч.6*/ образовалась задолженность </w:t>
+        <w:br/>
+        <w:t xml:space="preserve">за потребленные ресурсы (/*поставляемые ресурсы3*/) в сумме </w:t>
+      </w:r>
+      <w:r>
+        <w:rPr>
+          <w:rFonts w:eastAsia="Times New Roman" w:cs="Times New Roman" w:ascii="Times New Roman" w:hAnsi="Times New Roman"/>
+          <w:b/>
+          <w:sz w:val="24"/>
+          <w:szCs w:val="24"/>
+        </w:rPr>
+        <w:t xml:space="preserve">/*сумма долга*/ </w:t>
+      </w:r>
+      <w:r>
+        <w:rPr>
+          <w:rFonts w:eastAsia="Times New Roman" w:cs="Times New Roman" w:ascii="Times New Roman" w:hAnsi="Times New Roman"/>
+          <w:b w:val="false"/>
+          <w:i w:val="false"/>
+          <w:caps w:val="false"/>
+          <w:smallCaps w:val="false"/>
+          <w:strike w:val="false"/>
+          <w:dstrike w:val="false"/>
+          <w:color w:val="000000"/>
+          <w:position w:val="0"/>
+          <w:sz w:val="24"/>
+          <w:sz w:val="24"/>
+          <w:szCs w:val="24"/>
+          <w:u w:val="none"/>
+          <w:shd w:fill="auto" w:val="clear"/>
+          <w:vertAlign w:val="baseline"/>
+        </w:rPr>
+        <w:t>рублей</w:t>
+      </w:r>
+      <w:r>
+        <w:rPr>
+          <w:rFonts w:eastAsia="Times New Roman" w:cs="Times New Roman" w:ascii="Times New Roman" w:hAnsi="Times New Roman"/>
+          <w:b/>
+          <w:i w:val="false"/>
+          <w:caps w:val="false"/>
+          <w:smallCaps w:val="false"/>
+          <w:strike w:val="false"/>
+          <w:dstrike w:val="false"/>
+          <w:color w:val="000000"/>
+          <w:position w:val="0"/>
+          <w:sz w:val="24"/>
+          <w:sz w:val="24"/>
+          <w:szCs w:val="24"/>
+          <w:u w:val="none"/>
+          <w:shd w:fill="auto" w:val="clear"/>
+          <w:vertAlign w:val="baseline"/>
+        </w:rPr>
+        <w:t xml:space="preserve"> </w:t>
+      </w:r>
+      <w:r>
+        <w:rPr>
+          <w:rFonts w:eastAsia="Times New Roman" w:cs="Times New Roman" w:ascii="Times New Roman" w:hAnsi="Times New Roman"/>
+          <w:b w:val="false"/>
+          <w:i w:val="false"/>
+          <w:caps w:val="false"/>
+          <w:smallCaps w:val="false"/>
+          <w:strike w:val="false"/>
+          <w:dstrike w:val="false"/>
+          <w:color w:val="000000"/>
+          <w:position w:val="0"/>
+          <w:sz w:val="24"/>
+          <w:sz w:val="24"/>
+          <w:szCs w:val="24"/>
+          <w:u w:val="none"/>
+          <w:shd w:fill="auto" w:val="clear"/>
+          <w:vertAlign w:val="baseline"/>
+        </w:rPr>
+        <w:t>за указанный выше Период.</w:t>
+      </w:r>
+    </w:p>
+    <w:p>
+      <w:pPr>
+        <w:pStyle w:val="normal1"/>
+        <w:keepNext w:val="false"/>
+        <w:keepLines w:val="false"/>
+        <w:pageBreakBefore w:val="false"/>
+        <w:widowControl w:val="false"/>
+        <w:shd w:val="clear" w:fill="auto"/>
+        <w:tabs>
+          <w:tab w:val="clear" w:pos="720"/>
+          <w:tab w:val="left" w:pos="1136" w:leader="none"/>
+        </w:tabs>
+        <w:spacing w:lineRule="auto" w:line="240" w:before="0" w:after="0"/>
+        <w:ind w:firstLine="709" w:left="0" w:right="0"/>
+        <w:jc w:val="both"/>
         <w:rPr>
           <w:rFonts w:ascii="Times New Roman" w:hAnsi="Times New Roman"/>
           <w:sz w:val="24"/>
@@ -2002,7 +1994,7 @@
           <w:shd w:fill="auto" w:val="clear"/>
           <w:vertAlign w:val="baseline"/>
         </w:rPr>
-        <w:t>В соответствии с п. 1 ст. 539 ГК РФ по договору энергоснабжения энергоснабжающая организация обязуется подавать абоненту (потребителю) через присоединенную сеть энергию, а абонент обязуется оплачивать принятую энергию, а также соблюдать предусмотренный договором режим ее потребления, обеспечивать безопасность эксплуатации находящихся в его ведении энергетических сетей и исправность используемых им приборов и оборудования, связанных с потреблением энергии.</w:t>
+        <w:t>В соответствии с п. 1 ст. 539 Гражданского кодекса Российской Федерации (далее – «ГК РФ») по договору энергоснабжения энергоснабжающая организация обязуется подавать абоненту (потребителю) через присоединенную сеть энергию, а абонент обязуется оплачивать принятую энергию, а также соблюдать предусмотренный договором режим ее потребления, обеспечивать безопасность эксплуатации находящихся в его ведении энергетических сетей и исправность используемых им приборов и оборудования, связанных с потреблением энергии.</w:t>
       </w:r>
     </w:p>
     <w:p>
@@ -2212,7 +2204,7 @@
           <w:shd w:fill="auto" w:val="clear"/>
           <w:vertAlign w:val="baseline"/>
         </w:rPr>
-        <w:t xml:space="preserve">Поскольку Ответчик свои обязательства по оплате поставленной /*поставляемые ресурсы4*/ исполнил ненадлежащим образом, Истцом направлены в его адрес </w:t>
+        <w:t xml:space="preserve">Поскольку Ответчик свои обязательства по оплате поставленной /*поставляемые ресурсы4*/ исполнил ненадлежащим образом, Истцом направлен/*направлен окончание*/ в его адрес </w:t>
       </w:r>
       <w:r>
         <w:rPr>
@@ -2232,7 +2224,7 @@
           <w:shd w:fill="auto" w:val="clear"/>
           <w:vertAlign w:val="baseline"/>
         </w:rPr>
-        <w:t>претензии:</w:t>
+        <w:t>претензи/*претензия окончание и.п*/:</w:t>
       </w:r>
     </w:p>
     <w:p>
@@ -2336,7 +2328,7 @@
           <w:shd w:fill="auto" w:val="clear"/>
           <w:vertAlign w:val="baseline"/>
         </w:rPr>
-        <w:t>с предложением погасить образовавшуюся задолженность за /*поставляемые ресурсы4*/, которые оставлены Ответчиком без ответа. Задолженность в полном объеме не погашена. Копии претензий, а также документация в отношении направления/получения их Ответчиком, соблюдения претензионного порядка прилагаются к настоящему иску.</w:t>
+        <w:t>с предложением погасить образовавшуюся задолженность за /*поставляемые ресурсы4*/, котор/*которая окончание*/ оставлен/*оставлен окончание*/ Ответчиком без ответа. Задолженность в полном объеме не погашена. Копи/*копия окончание*/ претензи/*претензии окончание р.п*/, а также документация в отношении направления/получения /*её число*/ Ответчиком, соблюдения претензионного порядка прилагаются к настоящему иску.</w:t>
       </w:r>
     </w:p>
     <w:p>
@@ -2640,13 +2632,13 @@
         <w:tc>
           <w:tcPr>
             <w:tcW w:w="2110" w:type="dxa"/>
+            <w:tcBorders>
+              <w:top w:val="double" w:sz="4" w:space="0" w:color="000000"/>
+              <w:left w:val="double" w:sz="4" w:space="0" w:color="000000"/>
+              <w:bottom w:val="double" w:sz="4" w:space="0" w:color="000000"/>
+              <w:right w:val="double" w:sz="4" w:space="0" w:color="000000"/>
+            </w:tcBorders>
             <w:vAlign w:val="center"/>
-            <w:tcBorders>
-              <w:top w:val="double" w:sz="4" w:space="0" w:color="auto"/>
-              <w:left w:val="double" w:sz="4" w:space="0" w:color="auto"/>
-              <w:bottom w:val="double" w:sz="4" w:space="0" w:color="auto"/>
-              <w:right w:val="double" w:sz="4" w:space="0" w:color="auto"/>
-            </w:tcBorders>
           </w:tcPr>
           <w:p>
             <w:pPr>
@@ -2674,13 +2666,13 @@
         <w:tc>
           <w:tcPr>
             <w:tcW w:w="1847" w:type="dxa"/>
+            <w:tcBorders>
+              <w:top w:val="double" w:sz="4" w:space="0" w:color="000000"/>
+              <w:left w:val="double" w:sz="4" w:space="0" w:color="000000"/>
+              <w:bottom w:val="double" w:sz="4" w:space="0" w:color="000000"/>
+              <w:right w:val="double" w:sz="4" w:space="0" w:color="000000"/>
+            </w:tcBorders>
             <w:vAlign w:val="center"/>
-            <w:tcBorders>
-              <w:top w:val="double" w:sz="4" w:space="0" w:color="auto"/>
-              <w:left w:val="double" w:sz="4" w:space="0" w:color="auto"/>
-              <w:bottom w:val="double" w:sz="4" w:space="0" w:color="auto"/>
-              <w:right w:val="double" w:sz="4" w:space="0" w:color="auto"/>
-            </w:tcBorders>
           </w:tcPr>
           <w:p>
             <w:pPr>
@@ -2708,13 +2700,13 @@
         <w:tc>
           <w:tcPr>
             <w:tcW w:w="1698" w:type="dxa"/>
+            <w:tcBorders>
+              <w:top w:val="double" w:sz="4" w:space="0" w:color="000000"/>
+              <w:left w:val="double" w:sz="4" w:space="0" w:color="000000"/>
+              <w:bottom w:val="double" w:sz="4" w:space="0" w:color="000000"/>
+              <w:right w:val="double" w:sz="4" w:space="0" w:color="000000"/>
+            </w:tcBorders>
             <w:vAlign w:val="center"/>
-            <w:tcBorders>
-              <w:top w:val="double" w:sz="4" w:space="0" w:color="auto"/>
-              <w:left w:val="double" w:sz="4" w:space="0" w:color="auto"/>
-              <w:bottom w:val="double" w:sz="4" w:space="0" w:color="auto"/>
-              <w:right w:val="double" w:sz="4" w:space="0" w:color="auto"/>
-            </w:tcBorders>
           </w:tcPr>
           <w:p>
             <w:pPr>
@@ -2742,13 +2734,13 @@
         <w:tc>
           <w:tcPr>
             <w:tcW w:w="1420" w:type="dxa"/>
+            <w:tcBorders>
+              <w:top w:val="double" w:sz="4" w:space="0" w:color="000000"/>
+              <w:left w:val="double" w:sz="4" w:space="0" w:color="000000"/>
+              <w:bottom w:val="double" w:sz="4" w:space="0" w:color="000000"/>
+              <w:right w:val="double" w:sz="4" w:space="0" w:color="000000"/>
+            </w:tcBorders>
             <w:vAlign w:val="center"/>
-            <w:tcBorders>
-              <w:top w:val="double" w:sz="4" w:space="0" w:color="auto"/>
-              <w:left w:val="double" w:sz="4" w:space="0" w:color="auto"/>
-              <w:bottom w:val="double" w:sz="4" w:space="0" w:color="auto"/>
-              <w:right w:val="double" w:sz="4" w:space="0" w:color="auto"/>
-            </w:tcBorders>
           </w:tcPr>
           <w:p>
             <w:pPr>
@@ -2798,13 +2790,13 @@
         <w:tc>
           <w:tcPr>
             <w:tcW w:w="2249" w:type="dxa"/>
+            <w:tcBorders>
+              <w:top w:val="double" w:sz="4" w:space="0" w:color="000000"/>
+              <w:left w:val="double" w:sz="4" w:space="0" w:color="000000"/>
+              <w:bottom w:val="double" w:sz="4" w:space="0" w:color="000000"/>
+              <w:right w:val="double" w:sz="4" w:space="0" w:color="000000"/>
+            </w:tcBorders>
             <w:vAlign w:val="center"/>
-            <w:tcBorders>
-              <w:top w:val="double" w:sz="4" w:space="0" w:color="auto"/>
-              <w:left w:val="double" w:sz="4" w:space="0" w:color="auto"/>
-              <w:bottom w:val="double" w:sz="4" w:space="0" w:color="auto"/>
-              <w:right w:val="double" w:sz="4" w:space="0" w:color="auto"/>
-            </w:tcBorders>
           </w:tcPr>
           <w:p>
             <w:pPr>
@@ -2859,13 +2851,13 @@
         <w:tc>
           <w:tcPr>
             <w:tcW w:w="2110" w:type="dxa"/>
+            <w:tcBorders>
+              <w:top w:val="double" w:sz="4" w:space="0" w:color="000000"/>
+              <w:left w:val="double" w:sz="4" w:space="0" w:color="000000"/>
+              <w:bottom w:val="double" w:sz="4" w:space="0" w:color="000000"/>
+              <w:right w:val="double" w:sz="4" w:space="0" w:color="000000"/>
+            </w:tcBorders>
             <w:vAlign w:val="center"/>
-            <w:tcBorders>
-              <w:top w:val="double" w:sz="4" w:space="0" w:color="auto"/>
-              <w:left w:val="double" w:sz="4" w:space="0" w:color="auto"/>
-              <w:bottom w:val="double" w:sz="4" w:space="0" w:color="auto"/>
-              <w:right w:val="double" w:sz="4" w:space="0" w:color="auto"/>
-            </w:tcBorders>
           </w:tcPr>
           <w:p>
             <w:pPr>
@@ -2890,13 +2882,13 @@
         <w:tc>
           <w:tcPr>
             <w:tcW w:w="1847" w:type="dxa"/>
+            <w:tcBorders>
+              <w:top w:val="double" w:sz="4" w:space="0" w:color="000000"/>
+              <w:left w:val="double" w:sz="4" w:space="0" w:color="000000"/>
+              <w:bottom w:val="double" w:sz="4" w:space="0" w:color="000000"/>
+              <w:right w:val="double" w:sz="4" w:space="0" w:color="000000"/>
+            </w:tcBorders>
             <w:vAlign w:val="center"/>
-            <w:tcBorders>
-              <w:top w:val="double" w:sz="4" w:space="0" w:color="auto"/>
-              <w:left w:val="double" w:sz="4" w:space="0" w:color="auto"/>
-              <w:bottom w:val="double" w:sz="4" w:space="0" w:color="auto"/>
-              <w:right w:val="double" w:sz="4" w:space="0" w:color="auto"/>
-            </w:tcBorders>
           </w:tcPr>
           <w:p>
             <w:pPr>
@@ -2920,13 +2912,13 @@
         <w:tc>
           <w:tcPr>
             <w:tcW w:w="1698" w:type="dxa"/>
+            <w:tcBorders>
+              <w:top w:val="double" w:sz="4" w:space="0" w:color="000000"/>
+              <w:left w:val="double" w:sz="4" w:space="0" w:color="000000"/>
+              <w:bottom w:val="double" w:sz="4" w:space="0" w:color="000000"/>
+              <w:right w:val="double" w:sz="4" w:space="0" w:color="000000"/>
+            </w:tcBorders>
             <w:vAlign w:val="center"/>
-            <w:tcBorders>
-              <w:top w:val="double" w:sz="4" w:space="0" w:color="auto"/>
-              <w:left w:val="double" w:sz="4" w:space="0" w:color="auto"/>
-              <w:bottom w:val="double" w:sz="4" w:space="0" w:color="auto"/>
-              <w:right w:val="double" w:sz="4" w:space="0" w:color="auto"/>
-            </w:tcBorders>
           </w:tcPr>
           <w:p>
             <w:pPr>
@@ -2950,13 +2942,13 @@
         <w:tc>
           <w:tcPr>
             <w:tcW w:w="1420" w:type="dxa"/>
+            <w:tcBorders>
+              <w:top w:val="double" w:sz="4" w:space="0" w:color="000000"/>
+              <w:left w:val="double" w:sz="4" w:space="0" w:color="000000"/>
+              <w:bottom w:val="double" w:sz="4" w:space="0" w:color="000000"/>
+              <w:right w:val="double" w:sz="4" w:space="0" w:color="000000"/>
+            </w:tcBorders>
             <w:vAlign w:val="center"/>
-            <w:tcBorders>
-              <w:top w:val="double" w:sz="4" w:space="0" w:color="auto"/>
-              <w:left w:val="double" w:sz="4" w:space="0" w:color="auto"/>
-              <w:bottom w:val="double" w:sz="4" w:space="0" w:color="auto"/>
-              <w:right w:val="double" w:sz="4" w:space="0" w:color="auto"/>
-            </w:tcBorders>
           </w:tcPr>
           <w:p>
             <w:pPr>
@@ -2980,13 +2972,13 @@
         <w:tc>
           <w:tcPr>
             <w:tcW w:w="2249" w:type="dxa"/>
+            <w:tcBorders>
+              <w:top w:val="double" w:sz="4" w:space="0" w:color="000000"/>
+              <w:left w:val="double" w:sz="4" w:space="0" w:color="000000"/>
+              <w:bottom w:val="double" w:sz="4" w:space="0" w:color="000000"/>
+              <w:right w:val="double" w:sz="4" w:space="0" w:color="000000"/>
+            </w:tcBorders>
             <w:vAlign w:val="center"/>
-            <w:tcBorders>
-              <w:top w:val="double" w:sz="4" w:space="0" w:color="auto"/>
-              <w:left w:val="double" w:sz="4" w:space="0" w:color="auto"/>
-              <w:bottom w:val="double" w:sz="4" w:space="0" w:color="auto"/>
-              <w:right w:val="double" w:sz="4" w:space="0" w:color="auto"/>
-            </w:tcBorders>
           </w:tcPr>
           <w:p>
             <w:pPr>
@@ -3016,13 +3008,13 @@
           <w:tcPr>
             <w:tcW w:w="3957" w:type="dxa"/>
             <w:gridSpan w:val="2"/>
+            <w:tcBorders>
+              <w:top w:val="double" w:sz="4" w:space="0" w:color="000000"/>
+              <w:left w:val="double" w:sz="4" w:space="0" w:color="000000"/>
+              <w:bottom w:val="double" w:sz="4" w:space="0" w:color="000000"/>
+              <w:right w:val="double" w:sz="4" w:space="0" w:color="000000"/>
+            </w:tcBorders>
             <w:vAlign w:val="center"/>
-            <w:tcBorders>
-              <w:top w:val="double" w:sz="4" w:space="0" w:color="auto"/>
-              <w:left w:val="double" w:sz="4" w:space="0" w:color="auto"/>
-              <w:bottom w:val="double" w:sz="4" w:space="0" w:color="auto"/>
-              <w:right w:val="double" w:sz="4" w:space="0" w:color="auto"/>
-            </w:tcBorders>
           </w:tcPr>
           <w:p>
             <w:pPr>
@@ -3046,13 +3038,13 @@
         <w:tc>
           <w:tcPr>
             <w:tcW w:w="1698" w:type="dxa"/>
+            <w:tcBorders>
+              <w:top w:val="double" w:sz="4" w:space="0" w:color="000000"/>
+              <w:left w:val="double" w:sz="4" w:space="0" w:color="000000"/>
+              <w:bottom w:val="double" w:sz="4" w:space="0" w:color="000000"/>
+              <w:right w:val="double" w:sz="4" w:space="0" w:color="000000"/>
+            </w:tcBorders>
             <w:vAlign w:val="center"/>
-            <w:tcBorders>
-              <w:top w:val="double" w:sz="4" w:space="0" w:color="auto"/>
-              <w:left w:val="double" w:sz="4" w:space="0" w:color="auto"/>
-              <w:bottom w:val="double" w:sz="4" w:space="0" w:color="auto"/>
-              <w:right w:val="double" w:sz="4" w:space="0" w:color="auto"/>
-            </w:tcBorders>
           </w:tcPr>
           <w:p>
             <w:pPr>
@@ -3076,13 +3068,13 @@
         <w:tc>
           <w:tcPr>
             <w:tcW w:w="1420" w:type="dxa"/>
+            <w:tcBorders>
+              <w:top w:val="double" w:sz="4" w:space="0" w:color="000000"/>
+              <w:left w:val="double" w:sz="4" w:space="0" w:color="000000"/>
+              <w:bottom w:val="double" w:sz="4" w:space="0" w:color="000000"/>
+              <w:right w:val="double" w:sz="4" w:space="0" w:color="000000"/>
+            </w:tcBorders>
             <w:vAlign w:val="center"/>
-            <w:tcBorders>
-              <w:top w:val="double" w:sz="4" w:space="0" w:color="auto"/>
-              <w:left w:val="double" w:sz="4" w:space="0" w:color="auto"/>
-              <w:bottom w:val="double" w:sz="4" w:space="0" w:color="auto"/>
-              <w:right w:val="double" w:sz="4" w:space="0" w:color="auto"/>
-            </w:tcBorders>
           </w:tcPr>
           <w:p>
             <w:pPr>
@@ -3106,13 +3098,13 @@
         <w:tc>
           <w:tcPr>
             <w:tcW w:w="2249" w:type="dxa"/>
+            <w:tcBorders>
+              <w:top w:val="double" w:sz="4" w:space="0" w:color="000000"/>
+              <w:left w:val="double" w:sz="4" w:space="0" w:color="000000"/>
+              <w:bottom w:val="double" w:sz="4" w:space="0" w:color="000000"/>
+              <w:right w:val="double" w:sz="4" w:space="0" w:color="000000"/>
+            </w:tcBorders>
             <w:vAlign w:val="center"/>
-            <w:tcBorders>
-              <w:top w:val="double" w:sz="4" w:space="0" w:color="auto"/>
-              <w:left w:val="double" w:sz="4" w:space="0" w:color="auto"/>
-              <w:bottom w:val="double" w:sz="4" w:space="0" w:color="auto"/>
-              <w:right w:val="double" w:sz="4" w:space="0" w:color="auto"/>
-            </w:tcBorders>
           </w:tcPr>
           <w:p>
             <w:pPr>
@@ -3635,7 +3627,7 @@
           <w:shd w:fill="auto" w:val="clear"/>
           <w:vertAlign w:val="baseline"/>
         </w:rPr>
-        <w:t xml:space="preserve"> с </w:t>
+        <w:t xml:space="preserve"> с Ответчика </w:t>
       </w:r>
       <w:r>
         <w:rPr>
@@ -3719,7 +3711,7 @@
           <w:shd w:fill="auto" w:val="clear"/>
           <w:vertAlign w:val="baseline"/>
         </w:rPr>
-        <w:t>) в пользу Публичного акционерного общества «Московская объединенная энергетическая компания» (ОГРН /*истец огрн*/, ИНН /*истец инн*/) задолженность (основной долг) и неустойку по /*мн.ч.2*/ в общем размере</w:t>
+        <w:t>) в пользу Истца Публичное акционерное общество «Московская объединенная энергетическая компания» (ОГРН /*истец огрн*/, ИНН /*истец инн*/) задолженность (основной долг) и неустойку по /*мн.ч.2*/ в общем размере</w:t>
       </w:r>
       <w:r>
         <w:rPr>
@@ -4160,7 +4152,7 @@
           <w:shd w:fill="auto" w:val="clear"/>
           <w:vertAlign w:val="baseline"/>
         </w:rPr>
-        <w:t xml:space="preserve"> с /*ответчик полное имя*/ (ОГРН </w:t>
+        <w:t xml:space="preserve"> с Ответчика /*ответчик полное имя*/ (ОГРН </w:t>
       </w:r>
       <w:r>
         <w:rPr>
@@ -4216,7 +4208,7 @@
           <w:shd w:fill="auto" w:val="clear"/>
           <w:vertAlign w:val="baseline"/>
         </w:rPr>
-        <w:t xml:space="preserve">) в пользу Публичного акционерного общества «Московская объединенная энергетическая компания» (ОГРН /*истец огрн*/, ИНН /*истец инн*/) расходы по оплате государственной пошлины  за подачу настоящего иска </w:t>
+        <w:t xml:space="preserve">) в пользу Истца Публичное акционерное общество «Московская объединенная энергетическая компания» (ОГРН /*истец огрн*/, ИНН /*истец инн*/) расходы по оплате государственной пошлины  за подачу настоящего иска </w:t>
       </w:r>
       <w:r>
         <w:rPr>
@@ -6100,7 +6092,7 @@
       <w:widowControl/>
       <w:suppressAutoHyphens w:val="true"/>
       <w:bidi w:val="0"/>
-      <w:spacing w:lineRule="auto" w:line="276" w:before="0" w:after="200"/>
+      <w:spacing w:lineRule="auto" w:line="240" w:before="0" w:after="200"/>
       <w:jc w:val="left"/>
     </w:pPr>
     <w:rPr>

</xml_diff>